<commit_message>
segundo commit, creado clase Conexion.php
</commit_message>
<xml_diff>
--- a/Datos del proyecto y requisitos/Memoria del proyecto.docx
+++ b/Datos del proyecto y requisitos/Memoria del proyecto.docx
@@ -332,6 +332,14 @@
     </w:p>
     <w:p>
       <w:pPr>
+        <w:pStyle w:val="Ttulo1"/>
+      </w:pPr>
+      <w:r>
+        <w:t>INTRODUCCIÓN.</w:t>
+      </w:r>
+    </w:p>
+    <w:p>
+      <w:pPr>
         <w:pStyle w:val="Ttulo2"/>
       </w:pPr>
       <w:r>
@@ -343,11 +351,16 @@
     </w:p>
     <w:p>
       <w:r>
-        <w:t>El presente proyecto consiste en el diseño, desarrollo e implantación de una plataforma de comercio electrónico denominada Artesa</w:t>
+        <w:t xml:space="preserve">El presente proyecto consiste en el diseño, desarrollo e implantación de una plataforma de comercio electrónico denominada </w:t>
+      </w:r>
+      <w:proofErr w:type="spellStart"/>
+      <w:r>
+        <w:t>Artesa</w:t>
       </w:r>
       <w:r>
         <w:t>nosEnLinea</w:t>
       </w:r>
+      <w:proofErr w:type="spellEnd"/>
       <w:r>
         <w:t>, especializada en la comercialización de productos artesanales grabados en madera. La idea surge de</w:t>
       </w:r>
@@ -383,7 +396,23 @@
         <w:t xml:space="preserve">El proyecto trata de </w:t>
       </w:r>
       <w:r>
-        <w:t>demostrar cómo se puede construir una web totalmente funcional mediante el uso de técnicas y tecnologías utilizadas durante el curso, sin la necesidad de utilización de frameworks o el uso de plantillas predefinidas (tipo wordpress).</w:t>
+        <w:t xml:space="preserve">demostrar cómo se puede construir una web totalmente funcional mediante el uso de técnicas y tecnologías utilizadas durante el curso, sin la necesidad de utilización de </w:t>
+      </w:r>
+      <w:proofErr w:type="spellStart"/>
+      <w:r>
+        <w:t>frameworks</w:t>
+      </w:r>
+      <w:proofErr w:type="spellEnd"/>
+      <w:r>
+        <w:t xml:space="preserve"> o el uso de plantillas predefinidas (tipo </w:t>
+      </w:r>
+      <w:proofErr w:type="spellStart"/>
+      <w:r>
+        <w:t>wordpress</w:t>
+      </w:r>
+      <w:proofErr w:type="spellEnd"/>
+      <w:r>
+        <w:t>).</w:t>
       </w:r>
     </w:p>
     <w:p>
@@ -396,7 +425,15 @@
     </w:p>
     <w:p>
       <w:r>
-        <w:t>El proyecto será llevado con trabajo escalonado en varios días y poco a poco, recogiendo los avances en un repositorio de github abierto al público, para que pueda ser examinado por el tribunal.</w:t>
+        <w:t xml:space="preserve">El proyecto será llevado con trabajo escalonado en varios días y poco a poco, recogiendo los avances en un repositorio de </w:t>
+      </w:r>
+      <w:proofErr w:type="spellStart"/>
+      <w:r>
+        <w:t>github</w:t>
+      </w:r>
+      <w:proofErr w:type="spellEnd"/>
+      <w:r>
+        <w:t xml:space="preserve"> abierto al público, para que pueda ser examinado por el tribunal.</w:t>
       </w:r>
     </w:p>
     <w:p>
@@ -437,7 +474,15 @@
         </w:numPr>
       </w:pPr>
       <w:r>
-        <w:t>Para la interactividad en lado cliente, Javascript.</w:t>
+        <w:t xml:space="preserve">Para la interactividad en lado cliente, </w:t>
+      </w:r>
+      <w:proofErr w:type="spellStart"/>
+      <w:r>
+        <w:t>Javascript</w:t>
+      </w:r>
+      <w:proofErr w:type="spellEnd"/>
+      <w:r>
+        <w:t>.</w:t>
       </w:r>
     </w:p>
     <w:p>
@@ -461,7 +506,1106 @@
         </w:numPr>
       </w:pPr>
       <w:r>
-        <w:t>Para el desarrollo del back-end, PHP.</w:t>
+        <w:t>Para el desarrollo del back-</w:t>
+      </w:r>
+      <w:proofErr w:type="spellStart"/>
+      <w:r>
+        <w:t>end</w:t>
+      </w:r>
+      <w:proofErr w:type="spellEnd"/>
+      <w:r>
+        <w:t>, PHP.</w:t>
+      </w:r>
+    </w:p>
+    <w:p/>
+    <w:p/>
+    <w:p/>
+    <w:p>
+      <w:pPr>
+        <w:pStyle w:val="Ttulo2"/>
+      </w:pPr>
+      <w:r>
+        <w:t>Planificación para la tarea</w:t>
+      </w:r>
+    </w:p>
+    <w:p>
+      <w:r>
+        <w:t>Voy a tratar de organizarme de la siguiente manera, aunque como se sabe muchas veces los planes solo son guías que varían con el tiempo, creo que una forma coherente de planificar el trabajo del proyecto es la siguiente:</w:t>
+      </w:r>
+    </w:p>
+    <w:p>
+      <w:pPr>
+        <w:pStyle w:val="Prrafodelista"/>
+        <w:numPr>
+          <w:ilvl w:val="0"/>
+          <w:numId w:val="5"/>
+        </w:numPr>
+      </w:pPr>
+      <w:r>
+        <w:t xml:space="preserve">Primera parte. </w:t>
+      </w:r>
+      <w:r>
+        <w:t>Análisis de los requisitos del proyecto, diseño de BBDD y estructura del Modelo Vista Controlador. Aproximadamente 4 días / 1 semana</w:t>
+      </w:r>
+    </w:p>
+    <w:p>
+      <w:pPr>
+        <w:pStyle w:val="Prrafodelista"/>
+        <w:numPr>
+          <w:ilvl w:val="0"/>
+          <w:numId w:val="5"/>
+        </w:numPr>
+      </w:pPr>
+      <w:r>
+        <w:t xml:space="preserve">Segunda parte. </w:t>
+      </w:r>
+      <w:r>
+        <w:t xml:space="preserve">Desarrollo de CRUD (lo visto en el módulo de </w:t>
+      </w:r>
+      <w:proofErr w:type="spellStart"/>
+      <w:r>
+        <w:t>php</w:t>
+      </w:r>
+      <w:proofErr w:type="spellEnd"/>
+      <w:r>
+        <w:t xml:space="preserve">, siguiendo un esquema de los videos proporcionados en el curso (“garaje </w:t>
+      </w:r>
+      <w:proofErr w:type="spellStart"/>
+      <w:r>
+        <w:t>codepills</w:t>
+      </w:r>
+      <w:proofErr w:type="spellEnd"/>
+      <w:r>
+        <w:t>”). 1 semana / 10 días.</w:t>
+      </w:r>
+    </w:p>
+    <w:p>
+      <w:pPr>
+        <w:pStyle w:val="Prrafodelista"/>
+        <w:numPr>
+          <w:ilvl w:val="0"/>
+          <w:numId w:val="5"/>
+        </w:numPr>
+      </w:pPr>
+      <w:r>
+        <w:t>Tercera parte. Implementar el carrito y los pedidos. Si es tiempo añadir pasarela de pago (1 semana/10 días).</w:t>
+      </w:r>
+    </w:p>
+    <w:p>
+      <w:pPr>
+        <w:pStyle w:val="Prrafodelista"/>
+        <w:numPr>
+          <w:ilvl w:val="0"/>
+          <w:numId w:val="5"/>
+        </w:numPr>
+      </w:pPr>
+      <w:r>
+        <w:t>Cuarta y última parte. Maquetación final. CSS, ¿Bootstrap?, pruebas. 1 semana aproximadamente.</w:t>
+      </w:r>
+    </w:p>
+    <w:p/>
+    <w:p/>
+    <w:p/>
+    <w:p/>
+    <w:p/>
+    <w:p/>
+    <w:p/>
+    <w:p/>
+    <w:p/>
+    <w:p/>
+    <w:p/>
+    <w:p/>
+    <w:p/>
+    <w:p/>
+    <w:p>
+      <w:pPr>
+        <w:pStyle w:val="Ttulo1"/>
+        <w:jc w:val="center"/>
+      </w:pPr>
+      <w:r>
+        <w:t>PRIMERA PARTE.</w:t>
+      </w:r>
+    </w:p>
+    <w:p/>
+    <w:p/>
+    <w:p>
+      <w:pPr>
+        <w:pStyle w:val="Ttulo2"/>
+      </w:pPr>
+      <w:r>
+        <w:drawing>
+          <wp:anchor distT="0" distB="0" distL="114300" distR="114300" simplePos="0" relativeHeight="251661312" behindDoc="0" locked="0" layoutInCell="1" allowOverlap="1" wp14:anchorId="63979CE8" wp14:editId="44DA4D2E">
+            <wp:simplePos x="0" y="0"/>
+            <wp:positionH relativeFrom="column">
+              <wp:posOffset>3796665</wp:posOffset>
+            </wp:positionH>
+            <wp:positionV relativeFrom="paragraph">
+              <wp:posOffset>382270</wp:posOffset>
+            </wp:positionV>
+            <wp:extent cx="1703070" cy="3035300"/>
+            <wp:effectExtent l="0" t="0" r="0" b="0"/>
+            <wp:wrapSquare wrapText="bothSides"/>
+            <wp:docPr id="3" name="Imagen 3"/>
+            <wp:cNvGraphicFramePr>
+              <a:graphicFrameLocks xmlns:a="http://schemas.openxmlformats.org/drawingml/2006/main" noChangeAspect="1"/>
+            </wp:cNvGraphicFramePr>
+            <a:graphic xmlns:a="http://schemas.openxmlformats.org/drawingml/2006/main">
+              <a:graphicData uri="http://schemas.openxmlformats.org/drawingml/2006/picture">
+                <pic:pic xmlns:pic="http://schemas.openxmlformats.org/drawingml/2006/picture">
+                  <pic:nvPicPr>
+                    <pic:cNvPr id="1" name=""/>
+                    <pic:cNvPicPr/>
+                  </pic:nvPicPr>
+                  <pic:blipFill>
+                    <a:blip r:embed="rId5">
+                      <a:extLst>
+                        <a:ext uri="{28A0092B-C50C-407E-A947-70E740481C1C}">
+                          <a14:useLocalDpi xmlns:a14="http://schemas.microsoft.com/office/drawing/2010/main" val="0"/>
+                        </a:ext>
+                      </a:extLst>
+                    </a:blip>
+                    <a:stretch>
+                      <a:fillRect/>
+                    </a:stretch>
+                  </pic:blipFill>
+                  <pic:spPr>
+                    <a:xfrm>
+                      <a:off x="0" y="0"/>
+                      <a:ext cx="1703070" cy="3035300"/>
+                    </a:xfrm>
+                    <a:prstGeom prst="rect">
+                      <a:avLst/>
+                    </a:prstGeom>
+                  </pic:spPr>
+                </pic:pic>
+              </a:graphicData>
+            </a:graphic>
+            <wp14:sizeRelH relativeFrom="page">
+              <wp14:pctWidth>0</wp14:pctWidth>
+            </wp14:sizeRelH>
+            <wp14:sizeRelV relativeFrom="page">
+              <wp14:pctHeight>0</wp14:pctHeight>
+            </wp14:sizeRelV>
+          </wp:anchor>
+        </w:drawing>
+      </w:r>
+      <w:r>
+        <w:t>Estructura inicial del MVC</w:t>
+      </w:r>
+      <w:r>
+        <w:t xml:space="preserve"> </w:t>
+      </w:r>
+    </w:p>
+    <w:p>
+      <w:r>
+        <w:t>En la carpeta Datos del proyecto y requisitos guardo la memoria a presentar, así como otros datos de interés.</w:t>
+      </w:r>
+    </w:p>
+    <w:p>
+      <w:r>
+        <w:t>En base a los apuntes de clase, he dado el siguiente formato a la organización de la web en base al visto en asignaturas como DWES.</w:t>
+      </w:r>
+    </w:p>
+    <w:p>
+      <w:r>
+        <w:t xml:space="preserve">Por otro lado, hemos utilizado </w:t>
+      </w:r>
+      <w:proofErr w:type="spellStart"/>
+      <w:r>
+        <w:rPr>
+          <w:b/>
+          <w:bCs/>
+        </w:rPr>
+        <w:t>composer</w:t>
+      </w:r>
+      <w:proofErr w:type="spellEnd"/>
+      <w:r>
+        <w:t xml:space="preserve"> para que gestione directamente el </w:t>
+      </w:r>
+      <w:proofErr w:type="spellStart"/>
+      <w:r>
+        <w:t>autoload</w:t>
+      </w:r>
+      <w:proofErr w:type="spellEnd"/>
+      <w:r>
+        <w:t xml:space="preserve"> y evitar estar utili</w:t>
+      </w:r>
+      <w:r>
+        <w:t>z</w:t>
+      </w:r>
+      <w:r>
+        <w:t xml:space="preserve">ando </w:t>
+      </w:r>
+      <w:proofErr w:type="spellStart"/>
+      <w:r>
+        <w:t>require</w:t>
+      </w:r>
+      <w:proofErr w:type="spellEnd"/>
+      <w:r>
+        <w:t xml:space="preserve"> en cada una de las páginas. </w:t>
+      </w:r>
+    </w:p>
+    <w:p/>
+    <w:p>
+      <w:r>
+        <w:t>Breve descripción de cada una de las carpetas:</w:t>
+      </w:r>
+    </w:p>
+    <w:p>
+      <w:pPr>
+        <w:pStyle w:val="Prrafodelista"/>
+        <w:numPr>
+          <w:ilvl w:val="0"/>
+          <w:numId w:val="2"/>
+        </w:numPr>
+      </w:pPr>
+      <w:r>
+        <w:t xml:space="preserve">Dentro de </w:t>
+      </w:r>
+      <w:proofErr w:type="spellStart"/>
+      <w:r>
+        <w:rPr>
+          <w:b/>
+          <w:bCs/>
+        </w:rPr>
+        <w:t>src</w:t>
+      </w:r>
+      <w:proofErr w:type="spellEnd"/>
+      <w:r>
+        <w:rPr>
+          <w:b/>
+          <w:bCs/>
+        </w:rPr>
+        <w:t>:</w:t>
+      </w:r>
+    </w:p>
+    <w:p>
+      <w:pPr>
+        <w:pStyle w:val="Prrafodelista"/>
+        <w:numPr>
+          <w:ilvl w:val="1"/>
+          <w:numId w:val="2"/>
+        </w:numPr>
+      </w:pPr>
+      <w:proofErr w:type="spellStart"/>
+      <w:r>
+        <w:rPr>
+          <w:b/>
+          <w:bCs/>
+        </w:rPr>
+        <w:t>config</w:t>
+      </w:r>
+      <w:proofErr w:type="spellEnd"/>
+      <w:r>
+        <w:t>: Archivos de configuración</w:t>
+      </w:r>
+      <w:r>
+        <w:t xml:space="preserve">. Por ejemplo un archivo </w:t>
+      </w:r>
+      <w:proofErr w:type="spellStart"/>
+      <w:r>
+        <w:t>conexión.php</w:t>
+      </w:r>
+      <w:proofErr w:type="spellEnd"/>
+      <w:r>
+        <w:t xml:space="preserve"> para la conexión con la BBDD usando PDO (Lo aprendido en DWES).</w:t>
+      </w:r>
+    </w:p>
+    <w:p>
+      <w:pPr>
+        <w:pStyle w:val="Prrafodelista"/>
+        <w:numPr>
+          <w:ilvl w:val="1"/>
+          <w:numId w:val="2"/>
+        </w:numPr>
+      </w:pPr>
+      <w:proofErr w:type="spellStart"/>
+      <w:r>
+        <w:rPr>
+          <w:b/>
+          <w:bCs/>
+        </w:rPr>
+        <w:t>c</w:t>
+      </w:r>
+      <w:r>
+        <w:rPr>
+          <w:b/>
+          <w:bCs/>
+        </w:rPr>
+        <w:t>ontrollers</w:t>
+      </w:r>
+      <w:proofErr w:type="spellEnd"/>
+      <w:r>
+        <w:t>: Lógica de la aplicación.</w:t>
+      </w:r>
+      <w:r>
+        <w:t xml:space="preserve"> Las páginas que contienen la lógica para la interacción del usuario.</w:t>
+      </w:r>
+    </w:p>
+    <w:p>
+      <w:pPr>
+        <w:pStyle w:val="Prrafodelista"/>
+        <w:numPr>
+          <w:ilvl w:val="1"/>
+          <w:numId w:val="2"/>
+        </w:numPr>
+      </w:pPr>
+      <w:proofErr w:type="spellStart"/>
+      <w:r>
+        <w:rPr>
+          <w:b/>
+          <w:bCs/>
+        </w:rPr>
+        <w:t>models</w:t>
+      </w:r>
+      <w:proofErr w:type="spellEnd"/>
+      <w:r>
+        <w:t>: Interacción con la base de datos</w:t>
+      </w:r>
+      <w:r>
+        <w:t xml:space="preserve"> (como un almacén). Se creará una clase PHP por cada tabla en la BBDD.</w:t>
+      </w:r>
+    </w:p>
+    <w:p>
+      <w:pPr>
+        <w:pStyle w:val="Prrafodelista"/>
+        <w:numPr>
+          <w:ilvl w:val="0"/>
+          <w:numId w:val="2"/>
+        </w:numPr>
+      </w:pPr>
+      <w:proofErr w:type="spellStart"/>
+      <w:r>
+        <w:rPr>
+          <w:b/>
+          <w:bCs/>
+        </w:rPr>
+        <w:t>views</w:t>
+      </w:r>
+      <w:proofErr w:type="spellEnd"/>
+      <w:r>
+        <w:t>: Plantillas de visualización (HTML/PHP).</w:t>
+      </w:r>
+      <w:r>
+        <w:t xml:space="preserve"> </w:t>
+      </w:r>
+      <w:r>
+        <w:t xml:space="preserve">Pintar los datos que le envía el controlador. Aquí es donde </w:t>
+      </w:r>
+      <w:r>
+        <w:t xml:space="preserve">se aplican </w:t>
+      </w:r>
+      <w:r>
+        <w:t>estilos CSS.</w:t>
+      </w:r>
+    </w:p>
+    <w:p>
+      <w:pPr>
+        <w:pStyle w:val="Prrafodelista"/>
+        <w:numPr>
+          <w:ilvl w:val="0"/>
+          <w:numId w:val="2"/>
+        </w:numPr>
+      </w:pPr>
+      <w:proofErr w:type="spellStart"/>
+      <w:r>
+        <w:rPr>
+          <w:b/>
+          <w:bCs/>
+        </w:rPr>
+        <w:lastRenderedPageBreak/>
+        <w:t>public</w:t>
+      </w:r>
+      <w:proofErr w:type="spellEnd"/>
+      <w:r>
+        <w:t xml:space="preserve">: </w:t>
+      </w:r>
+      <w:r>
+        <w:rPr>
+          <w:b/>
+          <w:bCs/>
+        </w:rPr>
+        <w:t>El único directorio accesible desde la web</w:t>
+      </w:r>
+      <w:r>
+        <w:rPr>
+          <w:b/>
+          <w:bCs/>
+        </w:rPr>
+        <w:t>, y quizás por ello el más importante</w:t>
+      </w:r>
+      <w:r>
+        <w:t>.</w:t>
+      </w:r>
+    </w:p>
+    <w:p>
+      <w:pPr>
+        <w:pStyle w:val="Prrafodelista"/>
+        <w:numPr>
+          <w:ilvl w:val="1"/>
+          <w:numId w:val="2"/>
+        </w:numPr>
+        <w:rPr>
+          <w:lang w:val="en-US"/>
+        </w:rPr>
+      </w:pPr>
+      <w:proofErr w:type="spellStart"/>
+      <w:r>
+        <w:rPr>
+          <w:lang w:val="en-US"/>
+        </w:rPr>
+        <w:t>Index.php</w:t>
+      </w:r>
+      <w:proofErr w:type="spellEnd"/>
+      <w:r>
+        <w:rPr>
+          <w:lang w:val="en-US"/>
+        </w:rPr>
+        <w:t xml:space="preserve"> (</w:t>
+      </w:r>
+      <w:proofErr w:type="spellStart"/>
+      <w:r>
+        <w:rPr>
+          <w:lang w:val="en-US"/>
+        </w:rPr>
+        <w:t>el</w:t>
+      </w:r>
+      <w:proofErr w:type="spellEnd"/>
+      <w:r>
+        <w:rPr>
+          <w:lang w:val="en-US"/>
+        </w:rPr>
+        <w:t xml:space="preserve"> front controller).</w:t>
+      </w:r>
+    </w:p>
+    <w:p>
+      <w:pPr>
+        <w:pStyle w:val="Prrafodelista"/>
+        <w:numPr>
+          <w:ilvl w:val="1"/>
+          <w:numId w:val="2"/>
+        </w:numPr>
+      </w:pPr>
+      <w:r>
+        <w:t xml:space="preserve">Las carpetas </w:t>
+      </w:r>
+      <w:r>
+        <w:rPr>
+          <w:b/>
+          <w:bCs/>
+        </w:rPr>
+        <w:t>/</w:t>
+      </w:r>
+      <w:proofErr w:type="spellStart"/>
+      <w:r>
+        <w:rPr>
+          <w:b/>
+          <w:bCs/>
+        </w:rPr>
+        <w:t>css</w:t>
+      </w:r>
+      <w:proofErr w:type="spellEnd"/>
+      <w:r>
+        <w:t xml:space="preserve">, </w:t>
+      </w:r>
+      <w:r>
+        <w:rPr>
+          <w:b/>
+          <w:bCs/>
+        </w:rPr>
+        <w:t>/</w:t>
+      </w:r>
+      <w:proofErr w:type="spellStart"/>
+      <w:r>
+        <w:rPr>
+          <w:b/>
+          <w:bCs/>
+        </w:rPr>
+        <w:t>js</w:t>
+      </w:r>
+      <w:proofErr w:type="spellEnd"/>
+      <w:r>
+        <w:t xml:space="preserve">, </w:t>
+      </w:r>
+      <w:r>
+        <w:rPr>
+          <w:b/>
+          <w:bCs/>
+        </w:rPr>
+        <w:t>/</w:t>
+      </w:r>
+      <w:proofErr w:type="spellStart"/>
+      <w:r>
+        <w:rPr>
+          <w:b/>
+          <w:bCs/>
+        </w:rPr>
+        <w:t>img</w:t>
+      </w:r>
+      <w:proofErr w:type="spellEnd"/>
+      <w:r>
+        <w:rPr>
+          <w:b/>
+          <w:bCs/>
+        </w:rPr>
+        <w:t xml:space="preserve"> </w:t>
+      </w:r>
+      <w:r>
+        <w:t>para guardar dicho contenido.</w:t>
+      </w:r>
+    </w:p>
+    <w:p/>
+    <w:p>
+      <w:pPr>
+        <w:pStyle w:val="Ttulo2"/>
+      </w:pPr>
+      <w:r>
+        <w:t xml:space="preserve">Sincronización con </w:t>
+      </w:r>
+      <w:proofErr w:type="spellStart"/>
+      <w:r>
+        <w:t>github</w:t>
+      </w:r>
+      <w:proofErr w:type="spellEnd"/>
+      <w:r>
+        <w:t xml:space="preserve"> (sistema de control de versiones).</w:t>
+      </w:r>
+    </w:p>
+    <w:p>
+      <w:r>
+        <w:t xml:space="preserve">De manera breve explico la sincronización llevada a cabo con </w:t>
+      </w:r>
+      <w:proofErr w:type="spellStart"/>
+      <w:r>
+        <w:t>github</w:t>
+      </w:r>
+      <w:proofErr w:type="spellEnd"/>
+      <w:r>
+        <w:t>, así como indico el acceso al repositorio público.</w:t>
+      </w:r>
+    </w:p>
+    <w:p>
+      <w:pPr>
+        <w:numPr>
+          <w:ilvl w:val="0"/>
+          <w:numId w:val="4"/>
+        </w:numPr>
+        <w:rPr>
+          <w:b/>
+          <w:bCs/>
+        </w:rPr>
+      </w:pPr>
+      <w:r>
+        <w:t xml:space="preserve">Inicio </w:t>
+      </w:r>
+      <w:proofErr w:type="spellStart"/>
+      <w:r>
+        <w:t>git</w:t>
+      </w:r>
+      <w:proofErr w:type="spellEnd"/>
+      <w:r>
+        <w:t xml:space="preserve"> </w:t>
+      </w:r>
+      <w:proofErr w:type="spellStart"/>
+      <w:r>
+        <w:t>init</w:t>
+      </w:r>
+      <w:proofErr w:type="spellEnd"/>
+      <w:r>
+        <w:t xml:space="preserve"> en mi pc para crear repositorio </w:t>
+      </w:r>
+      <w:proofErr w:type="spellStart"/>
+      <w:r>
+        <w:t>git</w:t>
+      </w:r>
+      <w:proofErr w:type="spellEnd"/>
+      <w:r>
+        <w:t>.</w:t>
+      </w:r>
+      <w:r>
+        <w:rPr>
+          <w:b/>
+          <w:bCs/>
+        </w:rPr>
+        <w:t xml:space="preserve"> </w:t>
+      </w:r>
+    </w:p>
+    <w:p>
+      <w:pPr>
+        <w:numPr>
+          <w:ilvl w:val="0"/>
+          <w:numId w:val="4"/>
+        </w:numPr>
+        <w:rPr>
+          <w:b/>
+          <w:bCs/>
+        </w:rPr>
+      </w:pPr>
+      <w:r>
+        <w:t>Creo .</w:t>
+      </w:r>
+      <w:proofErr w:type="spellStart"/>
+      <w:r>
+        <w:t>gitignore</w:t>
+      </w:r>
+      <w:proofErr w:type="spellEnd"/>
+      <w:r>
+        <w:t xml:space="preserve"> para evitar que se sincronice todo el </w:t>
+      </w:r>
+      <w:proofErr w:type="spellStart"/>
+      <w:r>
+        <w:t>composer</w:t>
+      </w:r>
+      <w:proofErr w:type="spellEnd"/>
+      <w:r>
+        <w:t>.</w:t>
+      </w:r>
+    </w:p>
+    <w:p>
+      <w:pPr>
+        <w:numPr>
+          <w:ilvl w:val="0"/>
+          <w:numId w:val="4"/>
+        </w:numPr>
+        <w:rPr>
+          <w:lang w:val="en-US"/>
+        </w:rPr>
+      </w:pPr>
+      <w:r>
+        <w:t xml:space="preserve">Vincular repositorio remoto a </w:t>
+      </w:r>
+      <w:proofErr w:type="spellStart"/>
+      <w:r>
+        <w:t>github</w:t>
+      </w:r>
+      <w:proofErr w:type="spellEnd"/>
+      <w:r>
+        <w:t xml:space="preserve">: </w:t>
+      </w:r>
+      <w:r>
+        <w:rPr>
+          <w:lang w:val="en-US"/>
+        </w:rPr>
+        <w:t xml:space="preserve">git remote add origin </w:t>
+      </w:r>
+      <w:hyperlink r:id="rId6" w:history="1">
+        <w:r>
+          <w:rPr>
+            <w:rStyle w:val="Hipervnculo"/>
+            <w:lang w:val="en-US"/>
+          </w:rPr>
+          <w:t>https://github.com/celestinof/proyectoDAW.git</w:t>
+        </w:r>
+      </w:hyperlink>
+    </w:p>
+    <w:p>
+      <w:pPr>
+        <w:numPr>
+          <w:ilvl w:val="0"/>
+          <w:numId w:val="4"/>
+        </w:numPr>
+      </w:pPr>
+      <w:r>
+        <w:t>Renombrar la rama a “</w:t>
+      </w:r>
+      <w:proofErr w:type="spellStart"/>
+      <w:r>
+        <w:t>main</w:t>
+      </w:r>
+      <w:proofErr w:type="spellEnd"/>
+      <w:r>
+        <w:t xml:space="preserve">”, la nueva barra de </w:t>
+      </w:r>
+      <w:proofErr w:type="spellStart"/>
+      <w:r>
+        <w:t>github</w:t>
+      </w:r>
+      <w:proofErr w:type="spellEnd"/>
+      <w:r>
+        <w:t>.</w:t>
+      </w:r>
+    </w:p>
+    <w:p>
+      <w:pPr>
+        <w:numPr>
+          <w:ilvl w:val="0"/>
+          <w:numId w:val="4"/>
+        </w:numPr>
+      </w:pPr>
+      <w:r>
+        <w:t xml:space="preserve">Subir los archivos a la nube:  </w:t>
+      </w:r>
+      <w:proofErr w:type="spellStart"/>
+      <w:r>
+        <w:t>git</w:t>
+      </w:r>
+      <w:proofErr w:type="spellEnd"/>
+      <w:r>
+        <w:t xml:space="preserve"> </w:t>
+      </w:r>
+      <w:proofErr w:type="spellStart"/>
+      <w:r>
+        <w:t>push</w:t>
+      </w:r>
+      <w:proofErr w:type="spellEnd"/>
+      <w:r>
+        <w:t xml:space="preserve"> -u </w:t>
+      </w:r>
+      <w:proofErr w:type="spellStart"/>
+      <w:r>
+        <w:t>origin</w:t>
+      </w:r>
+      <w:proofErr w:type="spellEnd"/>
+      <w:r>
+        <w:t xml:space="preserve"> </w:t>
+      </w:r>
+      <w:proofErr w:type="spellStart"/>
+      <w:r>
+        <w:t>main</w:t>
+      </w:r>
+      <w:proofErr w:type="spellEnd"/>
+    </w:p>
+    <w:p>
+      <w:pPr>
+        <w:pStyle w:val="Ttulo2"/>
+      </w:pPr>
+    </w:p>
+    <w:p>
+      <w:pPr>
+        <w:pStyle w:val="Ttulo2"/>
+      </w:pPr>
+      <w:r>
+        <w:t>La estructura y la creación de la BBDD</w:t>
+      </w:r>
+    </w:p>
+    <w:p>
+      <w:r>
+        <w:t xml:space="preserve">Esta parte se trata de un punto crítico, puesto que necesitamos la base de datos para conectar usuarios con artículos y pedidos. En base a los estudiado en el módulo de bases de datos, la idea es crear una Base de datos </w:t>
+      </w:r>
+      <w:r>
+        <w:rPr>
+          <w:b/>
+          <w:bCs/>
+        </w:rPr>
+        <w:t>relacional</w:t>
+      </w:r>
+      <w:r>
+        <w:t>, con las siguientes tablas y atributos.</w:t>
+      </w:r>
+    </w:p>
+    <w:p>
+      <w:pPr>
+        <w:rPr>
+          <w:b/>
+          <w:bCs/>
+        </w:rPr>
+      </w:pPr>
+      <w:r>
+        <w:t>He dejado el archivo .</w:t>
+      </w:r>
+      <w:proofErr w:type="spellStart"/>
+      <w:r>
+        <w:t>sql</w:t>
+      </w:r>
+      <w:proofErr w:type="spellEnd"/>
+      <w:r>
+        <w:t xml:space="preserve"> de la base de datos </w:t>
+      </w:r>
+      <w:r>
+        <w:rPr>
+          <w:i/>
+          <w:iCs/>
+        </w:rPr>
+        <w:t xml:space="preserve">con las indicaciones de las tablas y atributos para que pueda ser revisada </w:t>
+      </w:r>
+      <w:r>
+        <w:rPr>
+          <w:i/>
+          <w:iCs/>
+        </w:rPr>
+        <w:t>fácilmente</w:t>
+      </w:r>
+      <w:r>
+        <w:t xml:space="preserve">. Se encuentra en </w:t>
+      </w:r>
+      <w:r>
+        <w:rPr>
+          <w:b/>
+          <w:bCs/>
+        </w:rPr>
+        <w:t>/</w:t>
+      </w:r>
+      <w:proofErr w:type="spellStart"/>
+      <w:r>
+        <w:rPr>
+          <w:b/>
+          <w:bCs/>
+        </w:rPr>
+        <w:t>src</w:t>
+      </w:r>
+      <w:proofErr w:type="spellEnd"/>
+      <w:r>
+        <w:rPr>
+          <w:b/>
+          <w:bCs/>
+        </w:rPr>
+        <w:t>/</w:t>
+      </w:r>
+      <w:proofErr w:type="spellStart"/>
+      <w:r>
+        <w:rPr>
+          <w:b/>
+          <w:bCs/>
+        </w:rPr>
+        <w:t>database</w:t>
+      </w:r>
+      <w:proofErr w:type="spellEnd"/>
+      <w:r>
+        <w:rPr>
+          <w:b/>
+          <w:bCs/>
+        </w:rPr>
+        <w:t>/</w:t>
+      </w:r>
+      <w:proofErr w:type="spellStart"/>
+      <w:r>
+        <w:rPr>
+          <w:b/>
+          <w:bCs/>
+        </w:rPr>
+        <w:t>artesanos_db.sql</w:t>
+      </w:r>
+      <w:proofErr w:type="spellEnd"/>
+    </w:p>
+    <w:p>
+      <w:r>
+        <w:lastRenderedPageBreak/>
+        <w:drawing>
+          <wp:anchor distT="0" distB="0" distL="114300" distR="114300" simplePos="0" relativeHeight="251662336" behindDoc="0" locked="0" layoutInCell="1" allowOverlap="1" wp14:anchorId="1A5EBA18" wp14:editId="20A36009">
+            <wp:simplePos x="0" y="0"/>
+            <wp:positionH relativeFrom="column">
+              <wp:posOffset>2516920</wp:posOffset>
+            </wp:positionH>
+            <wp:positionV relativeFrom="paragraph">
+              <wp:posOffset>290</wp:posOffset>
+            </wp:positionV>
+            <wp:extent cx="3002280" cy="2168525"/>
+            <wp:effectExtent l="0" t="0" r="7620" b="3175"/>
+            <wp:wrapSquare wrapText="bothSides"/>
+            <wp:docPr id="6" name="Imagen 6"/>
+            <wp:cNvGraphicFramePr>
+              <a:graphicFrameLocks xmlns:a="http://schemas.openxmlformats.org/drawingml/2006/main" noChangeAspect="1"/>
+            </wp:cNvGraphicFramePr>
+            <a:graphic xmlns:a="http://schemas.openxmlformats.org/drawingml/2006/main">
+              <a:graphicData uri="http://schemas.openxmlformats.org/drawingml/2006/picture">
+                <pic:pic xmlns:pic="http://schemas.openxmlformats.org/drawingml/2006/picture">
+                  <pic:nvPicPr>
+                    <pic:cNvPr id="1" name=""/>
+                    <pic:cNvPicPr/>
+                  </pic:nvPicPr>
+                  <pic:blipFill>
+                    <a:blip r:embed="rId7" cstate="print">
+                      <a:extLst>
+                        <a:ext uri="{28A0092B-C50C-407E-A947-70E740481C1C}">
+                          <a14:useLocalDpi xmlns:a14="http://schemas.microsoft.com/office/drawing/2010/main" val="0"/>
+                        </a:ext>
+                      </a:extLst>
+                    </a:blip>
+                    <a:stretch>
+                      <a:fillRect/>
+                    </a:stretch>
+                  </pic:blipFill>
+                  <pic:spPr>
+                    <a:xfrm>
+                      <a:off x="0" y="0"/>
+                      <a:ext cx="3002280" cy="2168525"/>
+                    </a:xfrm>
+                    <a:prstGeom prst="rect">
+                      <a:avLst/>
+                    </a:prstGeom>
+                  </pic:spPr>
+                </pic:pic>
+              </a:graphicData>
+            </a:graphic>
+            <wp14:sizeRelH relativeFrom="page">
+              <wp14:pctWidth>0</wp14:pctWidth>
+            </wp14:sizeRelH>
+            <wp14:sizeRelV relativeFrom="page">
+              <wp14:pctHeight>0</wp14:pctHeight>
+            </wp14:sizeRelV>
+          </wp:anchor>
+        </w:drawing>
+      </w:r>
+      <w:r>
+        <w:t xml:space="preserve">Para importarla, yo lo hago desde </w:t>
+      </w:r>
+      <w:proofErr w:type="spellStart"/>
+      <w:r>
+        <w:t>PHPMyAdmin</w:t>
+      </w:r>
+      <w:proofErr w:type="spellEnd"/>
+      <w:r>
+        <w:t>, tal como hicimos en el curso. Adjunto una captura</w:t>
+      </w:r>
+      <w:r>
+        <w:t>.</w:t>
+      </w:r>
+      <w:r>
+        <w:rPr>
+          <w:noProof/>
+        </w:rPr>
+        <w:t xml:space="preserve"> </w:t>
+      </w:r>
+    </w:p>
+    <w:p/>
+    <w:p/>
+    <w:p/>
+    <w:p/>
+    <w:p>
+      <w:r>
+        <w:t>Vista de la Base de datos en modo diseño:</w:t>
+      </w:r>
+    </w:p>
+    <w:p>
+      <w:r>
+        <w:rPr>
+          <w:noProof/>
+        </w:rPr>
+        <w:drawing>
+          <wp:inline distT="0" distB="0" distL="0" distR="0" wp14:anchorId="749A6BDC" wp14:editId="34C20217">
+            <wp:extent cx="5513164" cy="2944495"/>
+            <wp:effectExtent l="0" t="0" r="0" b="0"/>
+            <wp:docPr id="8" name="Gráfico 8"/>
+            <wp:cNvGraphicFramePr>
+              <a:graphicFrameLocks xmlns:a="http://schemas.openxmlformats.org/drawingml/2006/main" noChangeAspect="1"/>
+            </wp:cNvGraphicFramePr>
+            <a:graphic xmlns:a="http://schemas.openxmlformats.org/drawingml/2006/main">
+              <a:graphicData uri="http://schemas.openxmlformats.org/drawingml/2006/picture">
+                <pic:pic xmlns:pic="http://schemas.openxmlformats.org/drawingml/2006/picture">
+                  <pic:nvPicPr>
+                    <pic:cNvPr id="8" name="Gráfico 8"/>
+                    <pic:cNvPicPr/>
+                  </pic:nvPicPr>
+                  <pic:blipFill>
+                    <a:blip r:embed="rId8">
+                      <a:extLst>
+                        <a:ext uri="{96DAC541-7B7A-43D3-8B79-37D633B846F1}">
+                          <asvg:svgBlip xmlns:asvg="http://schemas.microsoft.com/office/drawing/2016/SVG/main" r:embed="rId9"/>
+                        </a:ext>
+                      </a:extLst>
+                    </a:blip>
+                    <a:stretch>
+                      <a:fillRect/>
+                    </a:stretch>
+                  </pic:blipFill>
+                  <pic:spPr>
+                    <a:xfrm>
+                      <a:off x="0" y="0"/>
+                      <a:ext cx="5519787" cy="2948032"/>
+                    </a:xfrm>
+                    <a:prstGeom prst="rect">
+                      <a:avLst/>
+                    </a:prstGeom>
+                  </pic:spPr>
+                </pic:pic>
+              </a:graphicData>
+            </a:graphic>
+          </wp:inline>
+        </w:drawing>
+      </w:r>
+    </w:p>
+    <w:p>
+      <w:pPr>
+        <w:pStyle w:val="Ttulo2"/>
+      </w:pPr>
+      <w:r>
+        <w:t>La conexión a la Base de datos. “</w:t>
+      </w:r>
+      <w:proofErr w:type="spellStart"/>
+      <w:r>
+        <w:t>Conexión.php</w:t>
+      </w:r>
+      <w:proofErr w:type="spellEnd"/>
+      <w:r>
+        <w:t>”</w:t>
+      </w:r>
+    </w:p>
+    <w:p>
+      <w:r>
+        <w:t xml:space="preserve">Dado que usamos </w:t>
+      </w:r>
+      <w:proofErr w:type="spellStart"/>
+      <w:r>
+        <w:rPr>
+          <w:b/>
+          <w:bCs/>
+        </w:rPr>
+        <w:t>composer</w:t>
+      </w:r>
+      <w:proofErr w:type="spellEnd"/>
+      <w:r>
+        <w:t xml:space="preserve"> con el </w:t>
+      </w:r>
+      <w:proofErr w:type="spellStart"/>
+      <w:r>
+        <w:t>autoload</w:t>
+      </w:r>
+      <w:proofErr w:type="spellEnd"/>
+      <w:r>
+        <w:t xml:space="preserve"> para gestionar las librerías, podemos simplificar el crear la conexión y usar un </w:t>
+      </w:r>
+      <w:proofErr w:type="spellStart"/>
+      <w:r>
+        <w:t>require_once</w:t>
+      </w:r>
+      <w:proofErr w:type="spellEnd"/>
+      <w:r>
+        <w:t xml:space="preserve"> en cada página que vaya a querer usarla. Para ello indicamos que el archivo de conexión está en la carpeta </w:t>
+      </w:r>
+      <w:proofErr w:type="spellStart"/>
+      <w:r>
+        <w:t>config</w:t>
+      </w:r>
+      <w:proofErr w:type="spellEnd"/>
+      <w:r>
+        <w:t xml:space="preserve">, dentro de </w:t>
+      </w:r>
+      <w:proofErr w:type="spellStart"/>
+      <w:r>
+        <w:t>src</w:t>
+      </w:r>
+      <w:proofErr w:type="spellEnd"/>
+      <w:r>
+        <w:t>.</w:t>
+      </w:r>
+    </w:p>
+    <w:p>
+      <w:r>
+        <w:t xml:space="preserve">Como en el </w:t>
+      </w:r>
+      <w:proofErr w:type="spellStart"/>
+      <w:r>
+        <w:t>autoload</w:t>
+      </w:r>
+      <w:proofErr w:type="spellEnd"/>
+      <w:r>
+        <w:t xml:space="preserve"> llamamos App a </w:t>
+      </w:r>
+      <w:proofErr w:type="spellStart"/>
+      <w:r>
+        <w:t>src</w:t>
+      </w:r>
+      <w:proofErr w:type="spellEnd"/>
+      <w:r>
+        <w:t>, entonces App\</w:t>
+      </w:r>
+      <w:proofErr w:type="spellStart"/>
+      <w:r>
+        <w:t>config</w:t>
+      </w:r>
+      <w:proofErr w:type="spellEnd"/>
+      <w:r>
+        <w:t>.</w:t>
       </w:r>
     </w:p>
     <w:p/>
@@ -492,7 +1636,7 @@
         <w:rFonts w:ascii="Calibri" w:eastAsiaTheme="minorHAnsi" w:hAnsi="Calibri" w:cs="Calibri" w:hint="default"/>
       </w:rPr>
     </w:lvl>
-    <w:lvl w:ilvl="1" w:tplc="0C0A0003" w:tentative="1">
+    <w:lvl w:ilvl="1" w:tplc="0C0A0003">
       <w:start w:val="1"/>
       <w:numFmt w:val="bullet"/>
       <w:lvlText w:val="o"/>
@@ -590,6 +1734,95 @@
     </w:lvl>
   </w:abstractNum>
   <w:abstractNum w:abstractNumId="1" w15:restartNumberingAfterBreak="0">
+    <w:nsid w:val="1ED2092A"/>
+    <w:multiLevelType w:val="hybridMultilevel"/>
+    <w:tmpl w:val="499650EC"/>
+    <w:lvl w:ilvl="0" w:tplc="0C0A000F">
+      <w:start w:val="1"/>
+      <w:numFmt w:val="decimal"/>
+      <w:lvlText w:val="%1."/>
+      <w:lvlJc w:val="left"/>
+      <w:pPr>
+        <w:ind w:left="720" w:hanging="360"/>
+      </w:pPr>
+      <w:rPr>
+        <w:rFonts w:hint="default"/>
+      </w:rPr>
+    </w:lvl>
+    <w:lvl w:ilvl="1" w:tplc="0C0A0019" w:tentative="1">
+      <w:start w:val="1"/>
+      <w:numFmt w:val="lowerLetter"/>
+      <w:lvlText w:val="%2."/>
+      <w:lvlJc w:val="left"/>
+      <w:pPr>
+        <w:ind w:left="1440" w:hanging="360"/>
+      </w:pPr>
+    </w:lvl>
+    <w:lvl w:ilvl="2" w:tplc="0C0A001B" w:tentative="1">
+      <w:start w:val="1"/>
+      <w:numFmt w:val="lowerRoman"/>
+      <w:lvlText w:val="%3."/>
+      <w:lvlJc w:val="right"/>
+      <w:pPr>
+        <w:ind w:left="2160" w:hanging="180"/>
+      </w:pPr>
+    </w:lvl>
+    <w:lvl w:ilvl="3" w:tplc="0C0A000F" w:tentative="1">
+      <w:start w:val="1"/>
+      <w:numFmt w:val="decimal"/>
+      <w:lvlText w:val="%4."/>
+      <w:lvlJc w:val="left"/>
+      <w:pPr>
+        <w:ind w:left="2880" w:hanging="360"/>
+      </w:pPr>
+    </w:lvl>
+    <w:lvl w:ilvl="4" w:tplc="0C0A0019" w:tentative="1">
+      <w:start w:val="1"/>
+      <w:numFmt w:val="lowerLetter"/>
+      <w:lvlText w:val="%5."/>
+      <w:lvlJc w:val="left"/>
+      <w:pPr>
+        <w:ind w:left="3600" w:hanging="360"/>
+      </w:pPr>
+    </w:lvl>
+    <w:lvl w:ilvl="5" w:tplc="0C0A001B" w:tentative="1">
+      <w:start w:val="1"/>
+      <w:numFmt w:val="lowerRoman"/>
+      <w:lvlText w:val="%6."/>
+      <w:lvlJc w:val="right"/>
+      <w:pPr>
+        <w:ind w:left="4320" w:hanging="180"/>
+      </w:pPr>
+    </w:lvl>
+    <w:lvl w:ilvl="6" w:tplc="0C0A000F" w:tentative="1">
+      <w:start w:val="1"/>
+      <w:numFmt w:val="decimal"/>
+      <w:lvlText w:val="%7."/>
+      <w:lvlJc w:val="left"/>
+      <w:pPr>
+        <w:ind w:left="5040" w:hanging="360"/>
+      </w:pPr>
+    </w:lvl>
+    <w:lvl w:ilvl="7" w:tplc="0C0A0019" w:tentative="1">
+      <w:start w:val="1"/>
+      <w:numFmt w:val="lowerLetter"/>
+      <w:lvlText w:val="%8."/>
+      <w:lvlJc w:val="left"/>
+      <w:pPr>
+        <w:ind w:left="5760" w:hanging="360"/>
+      </w:pPr>
+    </w:lvl>
+    <w:lvl w:ilvl="8" w:tplc="0C0A001B" w:tentative="1">
+      <w:start w:val="1"/>
+      <w:numFmt w:val="lowerRoman"/>
+      <w:lvlText w:val="%9."/>
+      <w:lvlJc w:val="right"/>
+      <w:pPr>
+        <w:ind w:left="6480" w:hanging="180"/>
+      </w:pPr>
+    </w:lvl>
+  </w:abstractNum>
+  <w:abstractNum w:abstractNumId="2" w15:restartNumberingAfterBreak="0">
     <w:nsid w:val="223456DD"/>
     <w:multiLevelType w:val="multilevel"/>
     <w:tmpl w:val="578E77A6"/>
@@ -738,11 +1971,261 @@
       </w:rPr>
     </w:lvl>
   </w:abstractNum>
+  <w:abstractNum w:abstractNumId="3" w15:restartNumberingAfterBreak="0">
+    <w:nsid w:val="61507A65"/>
+    <w:multiLevelType w:val="multilevel"/>
+    <w:tmpl w:val="C4E86FFC"/>
+    <w:lvl w:ilvl="0">
+      <w:start w:val="1"/>
+      <w:numFmt w:val="bullet"/>
+      <w:lvlText w:val=""/>
+      <w:lvlJc w:val="left"/>
+      <w:pPr>
+        <w:tabs>
+          <w:tab w:val="num" w:pos="1428"/>
+        </w:tabs>
+        <w:ind w:left="1428" w:hanging="360"/>
+      </w:pPr>
+      <w:rPr>
+        <w:rFonts w:ascii="Symbol" w:hAnsi="Symbol" w:hint="default"/>
+        <w:sz w:val="20"/>
+        <w:lang w:val="es-ES"/>
+      </w:rPr>
+    </w:lvl>
+    <w:lvl w:ilvl="1" w:tentative="1">
+      <w:start w:val="1"/>
+      <w:numFmt w:val="bullet"/>
+      <w:lvlText w:val="o"/>
+      <w:lvlJc w:val="left"/>
+      <w:pPr>
+        <w:tabs>
+          <w:tab w:val="num" w:pos="2148"/>
+        </w:tabs>
+        <w:ind w:left="2148" w:hanging="360"/>
+      </w:pPr>
+      <w:rPr>
+        <w:rFonts w:ascii="Courier New" w:hAnsi="Courier New" w:hint="default"/>
+        <w:sz w:val="20"/>
+      </w:rPr>
+    </w:lvl>
+    <w:lvl w:ilvl="2" w:tentative="1">
+      <w:start w:val="1"/>
+      <w:numFmt w:val="bullet"/>
+      <w:lvlText w:val=""/>
+      <w:lvlJc w:val="left"/>
+      <w:pPr>
+        <w:tabs>
+          <w:tab w:val="num" w:pos="2868"/>
+        </w:tabs>
+        <w:ind w:left="2868" w:hanging="360"/>
+      </w:pPr>
+      <w:rPr>
+        <w:rFonts w:ascii="Wingdings" w:hAnsi="Wingdings" w:hint="default"/>
+        <w:sz w:val="20"/>
+      </w:rPr>
+    </w:lvl>
+    <w:lvl w:ilvl="3" w:tentative="1">
+      <w:start w:val="1"/>
+      <w:numFmt w:val="bullet"/>
+      <w:lvlText w:val=""/>
+      <w:lvlJc w:val="left"/>
+      <w:pPr>
+        <w:tabs>
+          <w:tab w:val="num" w:pos="3588"/>
+        </w:tabs>
+        <w:ind w:left="3588" w:hanging="360"/>
+      </w:pPr>
+      <w:rPr>
+        <w:rFonts w:ascii="Wingdings" w:hAnsi="Wingdings" w:hint="default"/>
+        <w:sz w:val="20"/>
+      </w:rPr>
+    </w:lvl>
+    <w:lvl w:ilvl="4" w:tentative="1">
+      <w:start w:val="1"/>
+      <w:numFmt w:val="bullet"/>
+      <w:lvlText w:val=""/>
+      <w:lvlJc w:val="left"/>
+      <w:pPr>
+        <w:tabs>
+          <w:tab w:val="num" w:pos="4308"/>
+        </w:tabs>
+        <w:ind w:left="4308" w:hanging="360"/>
+      </w:pPr>
+      <w:rPr>
+        <w:rFonts w:ascii="Wingdings" w:hAnsi="Wingdings" w:hint="default"/>
+        <w:sz w:val="20"/>
+      </w:rPr>
+    </w:lvl>
+    <w:lvl w:ilvl="5" w:tentative="1">
+      <w:start w:val="1"/>
+      <w:numFmt w:val="bullet"/>
+      <w:lvlText w:val=""/>
+      <w:lvlJc w:val="left"/>
+      <w:pPr>
+        <w:tabs>
+          <w:tab w:val="num" w:pos="5028"/>
+        </w:tabs>
+        <w:ind w:left="5028" w:hanging="360"/>
+      </w:pPr>
+      <w:rPr>
+        <w:rFonts w:ascii="Wingdings" w:hAnsi="Wingdings" w:hint="default"/>
+        <w:sz w:val="20"/>
+      </w:rPr>
+    </w:lvl>
+    <w:lvl w:ilvl="6" w:tentative="1">
+      <w:start w:val="1"/>
+      <w:numFmt w:val="bullet"/>
+      <w:lvlText w:val=""/>
+      <w:lvlJc w:val="left"/>
+      <w:pPr>
+        <w:tabs>
+          <w:tab w:val="num" w:pos="5748"/>
+        </w:tabs>
+        <w:ind w:left="5748" w:hanging="360"/>
+      </w:pPr>
+      <w:rPr>
+        <w:rFonts w:ascii="Wingdings" w:hAnsi="Wingdings" w:hint="default"/>
+        <w:sz w:val="20"/>
+      </w:rPr>
+    </w:lvl>
+    <w:lvl w:ilvl="7" w:tentative="1">
+      <w:start w:val="1"/>
+      <w:numFmt w:val="bullet"/>
+      <w:lvlText w:val=""/>
+      <w:lvlJc w:val="left"/>
+      <w:pPr>
+        <w:tabs>
+          <w:tab w:val="num" w:pos="6468"/>
+        </w:tabs>
+        <w:ind w:left="6468" w:hanging="360"/>
+      </w:pPr>
+      <w:rPr>
+        <w:rFonts w:ascii="Wingdings" w:hAnsi="Wingdings" w:hint="default"/>
+        <w:sz w:val="20"/>
+      </w:rPr>
+    </w:lvl>
+    <w:lvl w:ilvl="8" w:tentative="1">
+      <w:start w:val="1"/>
+      <w:numFmt w:val="bullet"/>
+      <w:lvlText w:val=""/>
+      <w:lvlJc w:val="left"/>
+      <w:pPr>
+        <w:tabs>
+          <w:tab w:val="num" w:pos="7188"/>
+        </w:tabs>
+        <w:ind w:left="7188" w:hanging="360"/>
+      </w:pPr>
+      <w:rPr>
+        <w:rFonts w:ascii="Wingdings" w:hAnsi="Wingdings" w:hint="default"/>
+        <w:sz w:val="20"/>
+      </w:rPr>
+    </w:lvl>
+  </w:abstractNum>
+  <w:abstractNum w:abstractNumId="4" w15:restartNumberingAfterBreak="0">
+    <w:nsid w:val="73CC22EC"/>
+    <w:multiLevelType w:val="hybridMultilevel"/>
+    <w:tmpl w:val="831C5D76"/>
+    <w:lvl w:ilvl="0" w:tplc="DB86259E">
+      <w:start w:val="1"/>
+      <w:numFmt w:val="decimal"/>
+      <w:lvlText w:val="%1."/>
+      <w:lvlJc w:val="left"/>
+      <w:pPr>
+        <w:ind w:left="720" w:hanging="360"/>
+      </w:pPr>
+      <w:rPr>
+        <w:rFonts w:hint="default"/>
+        <w:b/>
+        <w:bCs/>
+      </w:rPr>
+    </w:lvl>
+    <w:lvl w:ilvl="1" w:tplc="0C0A0019" w:tentative="1">
+      <w:start w:val="1"/>
+      <w:numFmt w:val="lowerLetter"/>
+      <w:lvlText w:val="%2."/>
+      <w:lvlJc w:val="left"/>
+      <w:pPr>
+        <w:ind w:left="1440" w:hanging="360"/>
+      </w:pPr>
+    </w:lvl>
+    <w:lvl w:ilvl="2" w:tplc="0C0A001B" w:tentative="1">
+      <w:start w:val="1"/>
+      <w:numFmt w:val="lowerRoman"/>
+      <w:lvlText w:val="%3."/>
+      <w:lvlJc w:val="right"/>
+      <w:pPr>
+        <w:ind w:left="2160" w:hanging="180"/>
+      </w:pPr>
+    </w:lvl>
+    <w:lvl w:ilvl="3" w:tplc="0C0A000F" w:tentative="1">
+      <w:start w:val="1"/>
+      <w:numFmt w:val="decimal"/>
+      <w:lvlText w:val="%4."/>
+      <w:lvlJc w:val="left"/>
+      <w:pPr>
+        <w:ind w:left="2880" w:hanging="360"/>
+      </w:pPr>
+    </w:lvl>
+    <w:lvl w:ilvl="4" w:tplc="0C0A0019" w:tentative="1">
+      <w:start w:val="1"/>
+      <w:numFmt w:val="lowerLetter"/>
+      <w:lvlText w:val="%5."/>
+      <w:lvlJc w:val="left"/>
+      <w:pPr>
+        <w:ind w:left="3600" w:hanging="360"/>
+      </w:pPr>
+    </w:lvl>
+    <w:lvl w:ilvl="5" w:tplc="0C0A001B" w:tentative="1">
+      <w:start w:val="1"/>
+      <w:numFmt w:val="lowerRoman"/>
+      <w:lvlText w:val="%6."/>
+      <w:lvlJc w:val="right"/>
+      <w:pPr>
+        <w:ind w:left="4320" w:hanging="180"/>
+      </w:pPr>
+    </w:lvl>
+    <w:lvl w:ilvl="6" w:tplc="0C0A000F" w:tentative="1">
+      <w:start w:val="1"/>
+      <w:numFmt w:val="decimal"/>
+      <w:lvlText w:val="%7."/>
+      <w:lvlJc w:val="left"/>
+      <w:pPr>
+        <w:ind w:left="5040" w:hanging="360"/>
+      </w:pPr>
+    </w:lvl>
+    <w:lvl w:ilvl="7" w:tplc="0C0A0019" w:tentative="1">
+      <w:start w:val="1"/>
+      <w:numFmt w:val="lowerLetter"/>
+      <w:lvlText w:val="%8."/>
+      <w:lvlJc w:val="left"/>
+      <w:pPr>
+        <w:ind w:left="5760" w:hanging="360"/>
+      </w:pPr>
+    </w:lvl>
+    <w:lvl w:ilvl="8" w:tplc="0C0A001B" w:tentative="1">
+      <w:start w:val="1"/>
+      <w:numFmt w:val="lowerRoman"/>
+      <w:lvlText w:val="%9."/>
+      <w:lvlJc w:val="right"/>
+      <w:pPr>
+        <w:ind w:left="6480" w:hanging="180"/>
+      </w:pPr>
+    </w:lvl>
+  </w:abstractNum>
   <w:num w:numId="1" w16cid:durableId="1480533383">
-    <w:abstractNumId w:val="1"/>
+    <w:abstractNumId w:val="2"/>
   </w:num>
   <w:num w:numId="2" w16cid:durableId="287204733">
     <w:abstractNumId w:val="0"/>
+  </w:num>
+  <w:num w:numId="3" w16cid:durableId="1450778491">
+    <w:abstractNumId w:val="3"/>
+  </w:num>
+  <w:num w:numId="4" w16cid:durableId="323169028">
+    <w:abstractNumId w:val="4"/>
+  </w:num>
+  <w:num w:numId="5" w16cid:durableId="541527444">
+    <w:abstractNumId w:val="1"/>
   </w:num>
 </w:numbering>
 </file>
@@ -1357,7 +2840,6 @@
   <w:style w:type="character" w:default="1" w:styleId="Fuentedeprrafopredeter">
     <w:name w:val="Default Paragraph Font"/>
     <w:uiPriority w:val="1"/>
-    <w:semiHidden/>
     <w:unhideWhenUsed/>
   </w:style>
   <w:style w:type="table" w:default="1" w:styleId="Tablanormal">
@@ -1670,6 +3152,29 @@
       <w:spacing w:val="5"/>
     </w:rPr>
   </w:style>
+  <w:style w:type="character" w:styleId="Hipervnculo">
+    <w:name w:val="Hyperlink"/>
+    <w:basedOn w:val="Fuentedeprrafopredeter"/>
+    <w:uiPriority w:val="99"/>
+    <w:unhideWhenUsed/>
+    <w:rsid w:val="00040D9D"/>
+    <w:rPr>
+      <w:color w:val="467886" w:themeColor="hyperlink"/>
+      <w:u w:val="single"/>
+    </w:rPr>
+  </w:style>
+  <w:style w:type="character" w:styleId="Mencinsinresolver">
+    <w:name w:val="Unresolved Mention"/>
+    <w:basedOn w:val="Fuentedeprrafopredeter"/>
+    <w:uiPriority w:val="99"/>
+    <w:semiHidden/>
+    <w:unhideWhenUsed/>
+    <w:rsid w:val="00040D9D"/>
+    <w:rPr>
+      <w:color w:val="605E5C"/>
+      <w:shd w:val="clear" w:color="auto" w:fill="E1DFDD"/>
+    </w:rPr>
+  </w:style>
 </w:styles>
 </file>
 

</xml_diff>

<commit_message>
añadido crear.php en views/productos y añadida funcion crear en models producto.php
</commit_message>
<xml_diff>
--- a/Datos del proyecto y requisitos/Memoria del proyecto.docx
+++ b/Datos del proyecto y requisitos/Memoria del proyecto.docx
@@ -1,6 +1,6 @@
 
 <file path=word/document.xml><?xml version="1.0" encoding="utf-8"?>
-<w:document xmlns:wpc="http://schemas.microsoft.com/office/word/2010/wordprocessingCanvas" xmlns:cx="http://schemas.microsoft.com/office/drawing/2014/chartex" xmlns:cx1="http://schemas.microsoft.com/office/drawing/2015/9/8/chartex" xmlns:cx2="http://schemas.microsoft.com/office/drawing/2015/10/21/chartex" xmlns:cx3="http://schemas.microsoft.com/office/drawing/2016/5/9/chartex" xmlns:cx4="http://schemas.microsoft.com/office/drawing/2016/5/10/chartex" xmlns:cx5="http://schemas.microsoft.com/office/drawing/2016/5/11/chartex" xmlns:cx6="http://schemas.microsoft.com/office/drawing/2016/5/12/chartex" xmlns:cx7="http://schemas.microsoft.com/office/drawing/2016/5/13/chartex" xmlns:cx8="http://schemas.microsoft.com/office/drawing/2016/5/14/chartex" xmlns:mc="http://schemas.openxmlformats.org/markup-compatibility/2006" xmlns:aink="http://schemas.microsoft.com/office/drawing/2016/ink" xmlns:am3d="http://schemas.microsoft.com/office/drawing/2017/model3d" xmlns:o="urn:schemas-microsoft-com:office:office" xmlns:oel="http://schemas.microsoft.com/office/2019/extlst" xmlns:r="http://schemas.openxmlformats.org/officeDocument/2006/relationships" xmlns:m="http://schemas.openxmlformats.org/officeDocument/2006/math" xmlns:v="urn:schemas-microsoft-com:vml" xmlns:wp14="http://schemas.microsoft.com/office/word/2010/wordprocessingDrawing" xmlns:wp="http://schemas.openxmlformats.org/drawingml/2006/wordprocessingDrawing" xmlns:w10="urn:schemas-microsoft-com:office:word" xmlns:w="http://schemas.openxmlformats.org/wordprocessingml/2006/main" xmlns:w14="http://schemas.microsoft.com/office/word/2010/wordml" xmlns:w15="http://schemas.microsoft.com/office/word/2012/wordml" xmlns:w16cex="http://schemas.microsoft.com/office/word/2018/wordml/cex" xmlns:w16cid="http://schemas.microsoft.com/office/word/2016/wordml/cid" xmlns:w16="http://schemas.microsoft.com/office/word/2018/wordml" xmlns:w16du="http://schemas.microsoft.com/office/word/2023/wordml/word16du" xmlns:w16sdtdh="http://schemas.microsoft.com/office/word/2020/wordml/sdtdatahash" xmlns:w16sdtfl="http://schemas.microsoft.com/office/word/2024/wordml/sdtformatlock" xmlns:w16se="http://schemas.microsoft.com/office/word/2015/wordml/symex" xmlns:wpg="http://schemas.microsoft.com/office/word/2010/wordprocessingGroup" xmlns:wpi="http://schemas.microsoft.com/office/word/2010/wordprocessingInk" xmlns:wne="http://schemas.microsoft.com/office/word/2006/wordml" xmlns:wps="http://schemas.microsoft.com/office/word/2010/wordprocessingShape" mc:Ignorable="w14 w15 w16se w16cid w16 w16cex w16sdtdh w16sdtfl w16du wp14">
+<w:document xmlns:wpc="http://schemas.microsoft.com/office/word/2010/wordprocessingCanvas" xmlns:cx="http://schemas.microsoft.com/office/drawing/2014/chartex" xmlns:cx1="http://schemas.microsoft.com/office/drawing/2015/9/8/chartex" xmlns:cx2="http://schemas.microsoft.com/office/drawing/2015/10/21/chartex" xmlns:cx3="http://schemas.microsoft.com/office/drawing/2016/5/9/chartex" xmlns:cx4="http://schemas.microsoft.com/office/drawing/2016/5/10/chartex" xmlns:cx5="http://schemas.microsoft.com/office/drawing/2016/5/11/chartex" xmlns:cx6="http://schemas.microsoft.com/office/drawing/2016/5/12/chartex" xmlns:cx7="http://schemas.microsoft.com/office/drawing/2016/5/13/chartex" xmlns:cx8="http://schemas.microsoft.com/office/drawing/2016/5/14/chartex" xmlns:mc="http://schemas.openxmlformats.org/markup-compatibility/2006" xmlns:aink="http://schemas.microsoft.com/office/drawing/2016/ink" xmlns:am3d="http://schemas.microsoft.com/office/drawing/2017/model3d" xmlns:o="urn:schemas-microsoft-com:office:office" xmlns:oel="http://schemas.microsoft.com/office/2019/extlst" xmlns:r="http://schemas.openxmlformats.org/officeDocument/2006/relationships" xmlns:m="http://schemas.openxmlformats.org/officeDocument/2006/math" xmlns:v="urn:schemas-microsoft-com:vml" xmlns:wp14="http://schemas.microsoft.com/office/word/2010/wordprocessingDrawing" xmlns:wp="http://schemas.openxmlformats.org/drawingml/2006/wordprocessingDrawing" xmlns:w10="urn:schemas-microsoft-com:office:word" xmlns:w="http://schemas.openxmlformats.org/wordprocessingml/2006/main" xmlns:w14="http://schemas.microsoft.com/office/word/2010/wordml" xmlns:w15="http://schemas.microsoft.com/office/word/2012/wordml" xmlns:w16cex="http://schemas.microsoft.com/office/word/2018/wordml/cex" xmlns:w16cid="http://schemas.microsoft.com/office/word/2016/wordml/cid" xmlns:w16="http://schemas.microsoft.com/office/word/2018/wordml" xmlns:w16sdtdh="http://schemas.microsoft.com/office/word/2020/wordml/sdtdatahash" xmlns:w16se="http://schemas.microsoft.com/office/word/2015/wordml/symex" xmlns:wpg="http://schemas.microsoft.com/office/word/2010/wordprocessingGroup" xmlns:wpi="http://schemas.microsoft.com/office/word/2010/wordprocessingInk" xmlns:wne="http://schemas.microsoft.com/office/word/2006/wordml" xmlns:wps="http://schemas.microsoft.com/office/word/2010/wordprocessingShape" mc:Ignorable="w14 w15 w16se w16cid w16 w16cex w16sdtdh wp14">
   <w:body>
     <w:p>
       <w:pPr>
@@ -1066,7 +1066,7 @@
           <w:noProof/>
         </w:rPr>
         <w:drawing>
-          <wp:anchor distT="0" distB="0" distL="114300" distR="114300" simplePos="0" relativeHeight="251662336" behindDoc="0" locked="0" layoutInCell="1" allowOverlap="1" wp14:anchorId="1A5EBA18" wp14:editId="3142346D">
+          <wp:anchor distT="0" distB="0" distL="114300" distR="114300" simplePos="0" relativeHeight="251662336" behindDoc="0" locked="0" layoutInCell="1" allowOverlap="1" wp14:anchorId="1A5EBA18" wp14:editId="7AB04C97">
             <wp:simplePos x="0" y="0"/>
             <wp:positionH relativeFrom="column">
               <wp:posOffset>2516920</wp:posOffset>
@@ -1194,25 +1194,7 @@
     </w:p>
     <w:p>
       <w:r>
-        <w:t>Introduje algunos valores p</w:t>
-      </w:r>
-      <w:r>
-        <w:t>ara verificar el funcionamiento de los modelos</w:t>
-      </w:r>
-      <w:r>
-        <w:t>.</w:t>
-      </w:r>
-      <w:r>
-        <w:t xml:space="preserve"> </w:t>
-      </w:r>
-      <w:r>
-        <w:t>G</w:t>
-      </w:r>
-      <w:r>
-        <w:t>eneramos un script SQL con sentencias INSERT</w:t>
-      </w:r>
-      <w:r>
-        <w:t xml:space="preserve"> guardando el esquema de las tablas.</w:t>
+        <w:t>Introduje algunos valores para verificar el funcionamiento de los modelos. Generamos un script SQL con sentencias INSERT guardando el esquema de las tablas.</w:t>
       </w:r>
     </w:p>
     <w:p/>
@@ -1254,16 +1236,14 @@
     </w:p>
     <w:p>
       <w:r>
-        <w:t>E</w:t>
-      </w:r>
-      <w:r>
-        <w:t xml:space="preserve">n el directorio models , </w:t>
-      </w:r>
-      <w:r>
-        <w:t>vamos a crear una tabla PHP para cada tabla de la BBDD.</w:t>
-      </w:r>
-    </w:p>
-    <w:p>
+        <w:t xml:space="preserve">En el directorio src/models/, </w:t>
+      </w:r>
+      <w:r>
+        <w:t>tratamos de separar</w:t>
+      </w:r>
+      <w:r>
+        <w:t xml:space="preserve"> la lógica de persistencia de datos mediante la creación de una clase PHP por cada tabla de la base de datos relacional. El desarrollo ha comenzado con la clase Producto.php:</w:t>
+      </w:r>
       <w:r>
         <w:t xml:space="preserve">Empezamos con el </w:t>
       </w:r>
@@ -1276,13 +1256,53 @@
     </w:p>
     <w:p>
       <w:pPr>
+        <w:pStyle w:val="Prrafodelista"/>
+        <w:numPr>
+          <w:ilvl w:val="0"/>
+          <w:numId w:val="10"/>
+        </w:numPr>
+      </w:pPr>
+      <w:r>
+        <w:t xml:space="preserve"> </w:t>
+      </w:r>
+      <w:r>
+        <w:rPr>
+          <w:b/>
+          <w:bCs/>
+        </w:rPr>
+        <w:t>Método Constructor:</w:t>
+      </w:r>
+      <w:r>
+        <w:t xml:space="preserve"> Implementa la instanciación automática de la clase Conexion, abstrayendo el objeto PDO y almacenándolo en una propiedad </w:t>
+      </w:r>
+      <w:r>
+        <w:t>de clase</w:t>
+      </w:r>
+      <w:r>
+        <w:t xml:space="preserve"> para su uso interno.</w:t>
+      </w:r>
+    </w:p>
+    <w:p>
+      <w:pPr>
+        <w:pStyle w:val="Prrafodelista"/>
         <w:numPr>
           <w:ilvl w:val="0"/>
           <w:numId w:val="6"/>
         </w:numPr>
       </w:pPr>
       <w:r>
-        <w:t>Implementamos su método constructor para instanciar automáticamente la clase Conexion y guardar el objeto PDO.</w:t>
+        <w:lastRenderedPageBreak/>
+        <w:t xml:space="preserve">  </w:t>
+      </w:r>
+      <w:r>
+        <w:rPr>
+          <w:b/>
+          <w:bCs/>
+        </w:rPr>
+        <w:t>Método listarTodo():</w:t>
+      </w:r>
+      <w:r>
+        <w:t xml:space="preserve"> Encargado de interactuar con la base de datos para la extracción del catálogo completo. Se implementa mediante sentencias preparadas de PDO, ejecutando una consulta SELECT y retornando un array </w:t>
       </w:r>
     </w:p>
     <w:p>
@@ -1293,7 +1313,7 @@
         </w:numPr>
       </w:pPr>
       <w:r>
-        <w:t>Desarrollamos el método listarTodo(), encargado de ejecutar la consulta SELECT mediante sentencias preparadas y retornar los datos en un array asociativo limpio (PDO::FETCH_ASSOC).</w:t>
+        <w:t>Desarrollamos el método listarTodo(), encargado de ejecutar la consulta SELECT mediante sentencias preparadas y retornar los datos en un array asociativo (PDO::FETCH_ASSOC).</w:t>
       </w:r>
     </w:p>
     <w:p>
@@ -1301,7 +1321,6 @@
         <w:pStyle w:val="Ttulo2"/>
       </w:pPr>
       <w:r>
-        <w:lastRenderedPageBreak/>
         <w:t>Verificación en el Front Controller</w:t>
       </w:r>
       <w:r>
@@ -1362,13 +1381,7 @@
         <w:rPr>
           <w:u w:val="single"/>
         </w:rPr>
-        <w:t>c</w:t>
-      </w:r>
-      <w:r>
-        <w:rPr>
-          <w:u w:val="single"/>
-        </w:rPr>
-        <w:t>reamos</w:t>
+        <w:t>creamos</w:t>
       </w:r>
       <w:r>
         <w:t xml:space="preserve"> el archivo ProductoController.php con un método index() vacío, cuyo objetivo es pedir los datos al modelo para prepararlos antes de enviarlos a la vista.</w:t>
@@ -1386,7 +1399,7 @@
 </file>
 
 <file path=word/numbering.xml><?xml version="1.0" encoding="utf-8"?>
-<w:numbering xmlns:wpc="http://schemas.microsoft.com/office/word/2010/wordprocessingCanvas" xmlns:cx="http://schemas.microsoft.com/office/drawing/2014/chartex" xmlns:cx1="http://schemas.microsoft.com/office/drawing/2015/9/8/chartex" xmlns:cx2="http://schemas.microsoft.com/office/drawing/2015/10/21/chartex" xmlns:cx3="http://schemas.microsoft.com/office/drawing/2016/5/9/chartex" xmlns:cx4="http://schemas.microsoft.com/office/drawing/2016/5/10/chartex" xmlns:cx5="http://schemas.microsoft.com/office/drawing/2016/5/11/chartex" xmlns:cx6="http://schemas.microsoft.com/office/drawing/2016/5/12/chartex" xmlns:cx7="http://schemas.microsoft.com/office/drawing/2016/5/13/chartex" xmlns:cx8="http://schemas.microsoft.com/office/drawing/2016/5/14/chartex" xmlns:mc="http://schemas.openxmlformats.org/markup-compatibility/2006" xmlns:aink="http://schemas.microsoft.com/office/drawing/2016/ink" xmlns:am3d="http://schemas.microsoft.com/office/drawing/2017/model3d" xmlns:o="urn:schemas-microsoft-com:office:office" xmlns:oel="http://schemas.microsoft.com/office/2019/extlst" xmlns:r="http://schemas.openxmlformats.org/officeDocument/2006/relationships" xmlns:m="http://schemas.openxmlformats.org/officeDocument/2006/math" xmlns:v="urn:schemas-microsoft-com:vml" xmlns:wp14="http://schemas.microsoft.com/office/word/2010/wordprocessingDrawing" xmlns:wp="http://schemas.openxmlformats.org/drawingml/2006/wordprocessingDrawing" xmlns:w10="urn:schemas-microsoft-com:office:word" xmlns:w="http://schemas.openxmlformats.org/wordprocessingml/2006/main" xmlns:w14="http://schemas.microsoft.com/office/word/2010/wordml" xmlns:w15="http://schemas.microsoft.com/office/word/2012/wordml" xmlns:w16cex="http://schemas.microsoft.com/office/word/2018/wordml/cex" xmlns:w16cid="http://schemas.microsoft.com/office/word/2016/wordml/cid" xmlns:w16="http://schemas.microsoft.com/office/word/2018/wordml" xmlns:w16du="http://schemas.microsoft.com/office/word/2023/wordml/word16du" xmlns:w16sdtdh="http://schemas.microsoft.com/office/word/2020/wordml/sdtdatahash" xmlns:w16sdtfl="http://schemas.microsoft.com/office/word/2024/wordml/sdtformatlock" xmlns:w16se="http://schemas.microsoft.com/office/word/2015/wordml/symex" xmlns:wpg="http://schemas.microsoft.com/office/word/2010/wordprocessingGroup" xmlns:wpi="http://schemas.microsoft.com/office/word/2010/wordprocessingInk" xmlns:wne="http://schemas.microsoft.com/office/word/2006/wordml" xmlns:wps="http://schemas.microsoft.com/office/word/2010/wordprocessingShape" mc:Ignorable="w14 w15 w16se w16cid w16 w16cex w16sdtdh w16sdtfl w16du wp14">
+<w:numbering xmlns:wpc="http://schemas.microsoft.com/office/word/2010/wordprocessingCanvas" xmlns:cx="http://schemas.microsoft.com/office/drawing/2014/chartex" xmlns:cx1="http://schemas.microsoft.com/office/drawing/2015/9/8/chartex" xmlns:cx2="http://schemas.microsoft.com/office/drawing/2015/10/21/chartex" xmlns:cx3="http://schemas.microsoft.com/office/drawing/2016/5/9/chartex" xmlns:cx4="http://schemas.microsoft.com/office/drawing/2016/5/10/chartex" xmlns:cx5="http://schemas.microsoft.com/office/drawing/2016/5/11/chartex" xmlns:cx6="http://schemas.microsoft.com/office/drawing/2016/5/12/chartex" xmlns:cx7="http://schemas.microsoft.com/office/drawing/2016/5/13/chartex" xmlns:cx8="http://schemas.microsoft.com/office/drawing/2016/5/14/chartex" xmlns:mc="http://schemas.openxmlformats.org/markup-compatibility/2006" xmlns:aink="http://schemas.microsoft.com/office/drawing/2016/ink" xmlns:am3d="http://schemas.microsoft.com/office/drawing/2017/model3d" xmlns:o="urn:schemas-microsoft-com:office:office" xmlns:oel="http://schemas.microsoft.com/office/2019/extlst" xmlns:r="http://schemas.openxmlformats.org/officeDocument/2006/relationships" xmlns:m="http://schemas.openxmlformats.org/officeDocument/2006/math" xmlns:v="urn:schemas-microsoft-com:vml" xmlns:wp14="http://schemas.microsoft.com/office/word/2010/wordprocessingDrawing" xmlns:wp="http://schemas.openxmlformats.org/drawingml/2006/wordprocessingDrawing" xmlns:w10="urn:schemas-microsoft-com:office:word" xmlns:w="http://schemas.openxmlformats.org/wordprocessingml/2006/main" xmlns:w14="http://schemas.microsoft.com/office/word/2010/wordml" xmlns:w15="http://schemas.microsoft.com/office/word/2012/wordml" xmlns:w16cex="http://schemas.microsoft.com/office/word/2018/wordml/cex" xmlns:w16cid="http://schemas.microsoft.com/office/word/2016/wordml/cid" xmlns:w16="http://schemas.microsoft.com/office/word/2018/wordml" xmlns:w16sdtdh="http://schemas.microsoft.com/office/word/2020/wordml/sdtdatahash" xmlns:w16se="http://schemas.microsoft.com/office/word/2015/wordml/symex" xmlns:wpg="http://schemas.microsoft.com/office/word/2010/wordprocessingGroup" xmlns:wpi="http://schemas.microsoft.com/office/word/2010/wordprocessingInk" xmlns:wne="http://schemas.microsoft.com/office/word/2006/wordml" xmlns:wps="http://schemas.microsoft.com/office/word/2010/wordprocessingShape" mc:Ignorable="w14 w15 w16se w16cid w16 w16cex w16sdtdh wp14">
   <w:abstractNum w:abstractNumId="0" w15:restartNumberingAfterBreak="0">
     <w:nsid w:val="018A2A86"/>
     <w:multiLevelType w:val="multilevel"/>
@@ -1798,6 +1811,118 @@
     </w:lvl>
   </w:abstractNum>
   <w:abstractNum w:abstractNumId="3" w15:restartNumberingAfterBreak="0">
+    <w:nsid w:val="17154191"/>
+    <w:multiLevelType w:val="hybridMultilevel"/>
+    <w:tmpl w:val="57AE1868"/>
+    <w:lvl w:ilvl="0" w:tplc="B9546800">
+      <w:numFmt w:val="bullet"/>
+      <w:lvlText w:val=""/>
+      <w:lvlJc w:val="left"/>
+      <w:pPr>
+        <w:ind w:left="720" w:hanging="360"/>
+      </w:pPr>
+      <w:rPr>
+        <w:rFonts w:ascii="Symbol" w:eastAsiaTheme="minorHAnsi" w:hAnsi="Symbol" w:cstheme="minorBidi" w:hint="default"/>
+      </w:rPr>
+    </w:lvl>
+    <w:lvl w:ilvl="1" w:tplc="0C0A0003" w:tentative="1">
+      <w:start w:val="1"/>
+      <w:numFmt w:val="bullet"/>
+      <w:lvlText w:val="o"/>
+      <w:lvlJc w:val="left"/>
+      <w:pPr>
+        <w:ind w:left="1440" w:hanging="360"/>
+      </w:pPr>
+      <w:rPr>
+        <w:rFonts w:ascii="Courier New" w:hAnsi="Courier New" w:cs="Courier New" w:hint="default"/>
+      </w:rPr>
+    </w:lvl>
+    <w:lvl w:ilvl="2" w:tplc="0C0A0005" w:tentative="1">
+      <w:start w:val="1"/>
+      <w:numFmt w:val="bullet"/>
+      <w:lvlText w:val=""/>
+      <w:lvlJc w:val="left"/>
+      <w:pPr>
+        <w:ind w:left="2160" w:hanging="360"/>
+      </w:pPr>
+      <w:rPr>
+        <w:rFonts w:ascii="Wingdings" w:hAnsi="Wingdings" w:hint="default"/>
+      </w:rPr>
+    </w:lvl>
+    <w:lvl w:ilvl="3" w:tplc="0C0A0001" w:tentative="1">
+      <w:start w:val="1"/>
+      <w:numFmt w:val="bullet"/>
+      <w:lvlText w:val=""/>
+      <w:lvlJc w:val="left"/>
+      <w:pPr>
+        <w:ind w:left="2880" w:hanging="360"/>
+      </w:pPr>
+      <w:rPr>
+        <w:rFonts w:ascii="Symbol" w:hAnsi="Symbol" w:hint="default"/>
+      </w:rPr>
+    </w:lvl>
+    <w:lvl w:ilvl="4" w:tplc="0C0A0003" w:tentative="1">
+      <w:start w:val="1"/>
+      <w:numFmt w:val="bullet"/>
+      <w:lvlText w:val="o"/>
+      <w:lvlJc w:val="left"/>
+      <w:pPr>
+        <w:ind w:left="3600" w:hanging="360"/>
+      </w:pPr>
+      <w:rPr>
+        <w:rFonts w:ascii="Courier New" w:hAnsi="Courier New" w:cs="Courier New" w:hint="default"/>
+      </w:rPr>
+    </w:lvl>
+    <w:lvl w:ilvl="5" w:tplc="0C0A0005" w:tentative="1">
+      <w:start w:val="1"/>
+      <w:numFmt w:val="bullet"/>
+      <w:lvlText w:val=""/>
+      <w:lvlJc w:val="left"/>
+      <w:pPr>
+        <w:ind w:left="4320" w:hanging="360"/>
+      </w:pPr>
+      <w:rPr>
+        <w:rFonts w:ascii="Wingdings" w:hAnsi="Wingdings" w:hint="default"/>
+      </w:rPr>
+    </w:lvl>
+    <w:lvl w:ilvl="6" w:tplc="0C0A0001" w:tentative="1">
+      <w:start w:val="1"/>
+      <w:numFmt w:val="bullet"/>
+      <w:lvlText w:val=""/>
+      <w:lvlJc w:val="left"/>
+      <w:pPr>
+        <w:ind w:left="5040" w:hanging="360"/>
+      </w:pPr>
+      <w:rPr>
+        <w:rFonts w:ascii="Symbol" w:hAnsi="Symbol" w:hint="default"/>
+      </w:rPr>
+    </w:lvl>
+    <w:lvl w:ilvl="7" w:tplc="0C0A0003" w:tentative="1">
+      <w:start w:val="1"/>
+      <w:numFmt w:val="bullet"/>
+      <w:lvlText w:val="o"/>
+      <w:lvlJc w:val="left"/>
+      <w:pPr>
+        <w:ind w:left="5760" w:hanging="360"/>
+      </w:pPr>
+      <w:rPr>
+        <w:rFonts w:ascii="Courier New" w:hAnsi="Courier New" w:cs="Courier New" w:hint="default"/>
+      </w:rPr>
+    </w:lvl>
+    <w:lvl w:ilvl="8" w:tplc="0C0A0005" w:tentative="1">
+      <w:start w:val="1"/>
+      <w:numFmt w:val="bullet"/>
+      <w:lvlText w:val=""/>
+      <w:lvlJc w:val="left"/>
+      <w:pPr>
+        <w:ind w:left="6480" w:hanging="360"/>
+      </w:pPr>
+      <w:rPr>
+        <w:rFonts w:ascii="Wingdings" w:hAnsi="Wingdings" w:hint="default"/>
+      </w:rPr>
+    </w:lvl>
+  </w:abstractNum>
+  <w:abstractNum w:abstractNumId="4" w15:restartNumberingAfterBreak="0">
     <w:nsid w:val="1D631462"/>
     <w:multiLevelType w:val="multilevel"/>
     <w:tmpl w:val="3AC03024"/>
@@ -1946,7 +2071,7 @@
       </w:rPr>
     </w:lvl>
   </w:abstractNum>
-  <w:abstractNum w:abstractNumId="4" w15:restartNumberingAfterBreak="0">
+  <w:abstractNum w:abstractNumId="5" w15:restartNumberingAfterBreak="0">
     <w:nsid w:val="1ED2092A"/>
     <w:multiLevelType w:val="hybridMultilevel"/>
     <w:tmpl w:val="499650EC"/>
@@ -2035,7 +2160,7 @@
       </w:pPr>
     </w:lvl>
   </w:abstractNum>
-  <w:abstractNum w:abstractNumId="5" w15:restartNumberingAfterBreak="0">
+  <w:abstractNum w:abstractNumId="6" w15:restartNumberingAfterBreak="0">
     <w:nsid w:val="223456DD"/>
     <w:multiLevelType w:val="multilevel"/>
     <w:tmpl w:val="578E77A6"/>
@@ -2184,7 +2309,7 @@
       </w:rPr>
     </w:lvl>
   </w:abstractNum>
-  <w:abstractNum w:abstractNumId="6" w15:restartNumberingAfterBreak="0">
+  <w:abstractNum w:abstractNumId="7" w15:restartNumberingAfterBreak="0">
     <w:nsid w:val="2F6740C6"/>
     <w:multiLevelType w:val="multilevel"/>
     <w:tmpl w:val="55006B08"/>
@@ -2333,7 +2458,7 @@
       </w:rPr>
     </w:lvl>
   </w:abstractNum>
-  <w:abstractNum w:abstractNumId="7" w15:restartNumberingAfterBreak="0">
+  <w:abstractNum w:abstractNumId="8" w15:restartNumberingAfterBreak="0">
     <w:nsid w:val="61507A65"/>
     <w:multiLevelType w:val="multilevel"/>
     <w:tmpl w:val="C4E86FFC"/>
@@ -2483,7 +2608,7 @@
       </w:rPr>
     </w:lvl>
   </w:abstractNum>
-  <w:abstractNum w:abstractNumId="8" w15:restartNumberingAfterBreak="0">
+  <w:abstractNum w:abstractNumId="9" w15:restartNumberingAfterBreak="0">
     <w:nsid w:val="73CC22EC"/>
     <w:multiLevelType w:val="hybridMultilevel"/>
     <w:tmpl w:val="831C5D76"/>
@@ -2575,37 +2700,40 @@
     </w:lvl>
   </w:abstractNum>
   <w:num w:numId="1" w16cid:durableId="1480533383">
-    <w:abstractNumId w:val="5"/>
+    <w:abstractNumId w:val="6"/>
   </w:num>
   <w:num w:numId="2" w16cid:durableId="287204733">
     <w:abstractNumId w:val="2"/>
   </w:num>
   <w:num w:numId="3" w16cid:durableId="1450778491">
-    <w:abstractNumId w:val="7"/>
+    <w:abstractNumId w:val="8"/>
   </w:num>
   <w:num w:numId="4" w16cid:durableId="323169028">
-    <w:abstractNumId w:val="8"/>
+    <w:abstractNumId w:val="9"/>
   </w:num>
   <w:num w:numId="5" w16cid:durableId="541527444">
-    <w:abstractNumId w:val="4"/>
+    <w:abstractNumId w:val="5"/>
   </w:num>
   <w:num w:numId="6" w16cid:durableId="1928541995">
     <w:abstractNumId w:val="0"/>
   </w:num>
   <w:num w:numId="7" w16cid:durableId="1247150757">
-    <w:abstractNumId w:val="6"/>
+    <w:abstractNumId w:val="7"/>
   </w:num>
   <w:num w:numId="8" w16cid:durableId="216165823">
-    <w:abstractNumId w:val="3"/>
+    <w:abstractNumId w:val="4"/>
   </w:num>
   <w:num w:numId="9" w16cid:durableId="1473448355">
     <w:abstractNumId w:val="1"/>
+  </w:num>
+  <w:num w:numId="10" w16cid:durableId="410271980">
+    <w:abstractNumId w:val="3"/>
   </w:num>
 </w:numbering>
 </file>
 
 <file path=word/styles.xml><?xml version="1.0" encoding="utf-8"?>
-<w:styles xmlns:mc="http://schemas.openxmlformats.org/markup-compatibility/2006" xmlns:r="http://schemas.openxmlformats.org/officeDocument/2006/relationships" xmlns:w="http://schemas.openxmlformats.org/wordprocessingml/2006/main" xmlns:w14="http://schemas.microsoft.com/office/word/2010/wordml" xmlns:w15="http://schemas.microsoft.com/office/word/2012/wordml" xmlns:w16cex="http://schemas.microsoft.com/office/word/2018/wordml/cex" xmlns:w16cid="http://schemas.microsoft.com/office/word/2016/wordml/cid" xmlns:w16="http://schemas.microsoft.com/office/word/2018/wordml" xmlns:w16du="http://schemas.microsoft.com/office/word/2023/wordml/word16du" xmlns:w16sdtdh="http://schemas.microsoft.com/office/word/2020/wordml/sdtdatahash" xmlns:w16sdtfl="http://schemas.microsoft.com/office/word/2024/wordml/sdtformatlock" xmlns:w16se="http://schemas.microsoft.com/office/word/2015/wordml/symex" mc:Ignorable="w14 w15 w16se w16cid w16 w16cex w16sdtdh w16sdtfl w16du">
+<w:styles xmlns:mc="http://schemas.openxmlformats.org/markup-compatibility/2006" xmlns:r="http://schemas.openxmlformats.org/officeDocument/2006/relationships" xmlns:w="http://schemas.openxmlformats.org/wordprocessingml/2006/main" xmlns:w14="http://schemas.microsoft.com/office/word/2010/wordml" xmlns:w15="http://schemas.microsoft.com/office/word/2012/wordml" xmlns:w16cex="http://schemas.microsoft.com/office/word/2018/wordml/cex" xmlns:w16cid="http://schemas.microsoft.com/office/word/2016/wordml/cid" xmlns:w16="http://schemas.microsoft.com/office/word/2018/wordml" xmlns:w16sdtdh="http://schemas.microsoft.com/office/word/2020/wordml/sdtdatahash" xmlns:w16se="http://schemas.microsoft.com/office/word/2015/wordml/symex" mc:Ignorable="w14 w15 w16se w16cid w16 w16cex w16sdtdh">
   <w:docDefaults>
     <w:rPrDefault>
       <w:rPr>

</xml_diff>

<commit_message>
añadidas vistas y controladores. Trabajo del 1,2 y el 3
</commit_message>
<xml_diff>
--- a/Datos del proyecto y requisitos/Memoria del proyecto.docx
+++ b/Datos del proyecto y requisitos/Memoria del proyecto.docx
@@ -350,11 +350,16 @@
     </w:p>
     <w:p>
       <w:r>
-        <w:t>El presente proyecto consiste en el diseño, desarrollo e implantación de una plataforma de comercio electrónico denominada Artesa</w:t>
+        <w:t xml:space="preserve">El presente proyecto consiste en el diseño, desarrollo e implantación de una plataforma de comercio electrónico denominada </w:t>
+      </w:r>
+      <w:proofErr w:type="spellStart"/>
+      <w:r>
+        <w:t>Artesa</w:t>
       </w:r>
       <w:r>
         <w:t>nosEnLinea</w:t>
       </w:r>
+      <w:proofErr w:type="spellEnd"/>
       <w:r>
         <w:t>, especializada en la comercialización de productos artesanales grabados en madera. La idea surge de</w:t>
       </w:r>
@@ -387,7 +392,23 @@
         <w:t xml:space="preserve">El proyecto trata de </w:t>
       </w:r>
       <w:r>
-        <w:t>demostrar cómo se puede construir una web totalmente funcional mediante el uso de técnicas y tecnologías utilizadas durante el curso, sin la necesidad de utilización de frameworks o el uso de plantillas predefinidas (tipo wordpress).</w:t>
+        <w:t xml:space="preserve">demostrar cómo se puede construir una web totalmente funcional mediante el uso de técnicas y tecnologías utilizadas durante el curso, sin la necesidad de utilización de </w:t>
+      </w:r>
+      <w:proofErr w:type="spellStart"/>
+      <w:r>
+        <w:t>frameworks</w:t>
+      </w:r>
+      <w:proofErr w:type="spellEnd"/>
+      <w:r>
+        <w:t xml:space="preserve"> o el uso de plantillas predefinidas (tipo </w:t>
+      </w:r>
+      <w:proofErr w:type="spellStart"/>
+      <w:r>
+        <w:t>wordpress</w:t>
+      </w:r>
+      <w:proofErr w:type="spellEnd"/>
+      <w:r>
+        <w:t>).</w:t>
       </w:r>
     </w:p>
     <w:p>
@@ -400,7 +421,15 @@
     </w:p>
     <w:p>
       <w:r>
-        <w:t>El proyecto será llevado con trabajo escalonado en varios días y poco a poco, recogiendo los avances en un repositorio de github abierto al público, para que pueda ser examinado por el tribunal.</w:t>
+        <w:t xml:space="preserve">El proyecto será llevado con trabajo escalonado en varios días y poco a poco, recogiendo los avances en un repositorio de </w:t>
+      </w:r>
+      <w:proofErr w:type="spellStart"/>
+      <w:r>
+        <w:t>github</w:t>
+      </w:r>
+      <w:proofErr w:type="spellEnd"/>
+      <w:r>
+        <w:t xml:space="preserve"> abierto al público, para que pueda ser examinado por el tribunal.</w:t>
       </w:r>
     </w:p>
     <w:p>
@@ -441,7 +470,15 @@
         </w:numPr>
       </w:pPr>
       <w:r>
-        <w:t>Para la interactividad en lado cliente, Javascript.</w:t>
+        <w:t xml:space="preserve">Para la interactividad en lado cliente, </w:t>
+      </w:r>
+      <w:proofErr w:type="spellStart"/>
+      <w:r>
+        <w:t>Javascript</w:t>
+      </w:r>
+      <w:proofErr w:type="spellEnd"/>
+      <w:r>
+        <w:t>.</w:t>
       </w:r>
     </w:p>
     <w:p>
@@ -465,17 +502,24 @@
         </w:numPr>
       </w:pPr>
       <w:r>
-        <w:t>Para el desarrollo del back-end, PHP.</w:t>
-      </w:r>
-    </w:p>
-    <w:p/>
-    <w:p/>
+        <w:t>Para el desarrollo del back-</w:t>
+      </w:r>
+      <w:proofErr w:type="spellStart"/>
+      <w:r>
+        <w:t>end</w:t>
+      </w:r>
+      <w:proofErr w:type="spellEnd"/>
+      <w:r>
+        <w:t>, PHP.</w:t>
+      </w:r>
+    </w:p>
     <w:p/>
     <w:p>
       <w:pPr>
         <w:pStyle w:val="Ttulo2"/>
       </w:pPr>
       <w:r>
+        <w:lastRenderedPageBreak/>
         <w:t>Planificación para la tarea</w:t>
       </w:r>
     </w:p>
@@ -511,7 +555,23 @@
         <w:t xml:space="preserve">Segunda parte. </w:t>
       </w:r>
       <w:r>
-        <w:t>Desarrollo de CRUD (lo visto en el módulo de php, siguiendo un esquema de los videos proporcionados en el curso (“garaje codepills”). 1 semana / 10 días.</w:t>
+        <w:t xml:space="preserve">Desarrollo de CRUD (lo visto en el módulo de </w:t>
+      </w:r>
+      <w:proofErr w:type="spellStart"/>
+      <w:r>
+        <w:t>php</w:t>
+      </w:r>
+      <w:proofErr w:type="spellEnd"/>
+      <w:r>
+        <w:t xml:space="preserve">, siguiendo un esquema de los videos proporcionados en el curso (“garaje </w:t>
+      </w:r>
+      <w:proofErr w:type="spellStart"/>
+      <w:r>
+        <w:t>codepills</w:t>
+      </w:r>
+      <w:proofErr w:type="spellEnd"/>
+      <w:r>
+        <w:t>”). 1 semana / 10 días.</w:t>
       </w:r>
     </w:p>
     <w:p>
@@ -535,9 +595,557 @@
         </w:numPr>
       </w:pPr>
       <w:r>
-        <w:t>Cuarta y última parte. Maquetación final. CSS, ¿Bootstrap?, pruebas. 1 semana aproximadamente.</w:t>
-      </w:r>
-    </w:p>
+        <w:t>Cuarta y última parte. Maquetación final. CSS, Bootstrap, pruebas. 1 semana aproximadamente.</w:t>
+      </w:r>
+    </w:p>
+    <w:p/>
+    <w:p>
+      <w:pPr>
+        <w:pStyle w:val="Ttulo2"/>
+      </w:pPr>
+      <w:r>
+        <w:t>La</w:t>
+      </w:r>
+      <w:r>
+        <w:t xml:space="preserve"> Arquitectura</w:t>
+      </w:r>
+    </w:p>
+    <w:p>
+      <w:r>
+        <w:t>El sistema está estructurado bajo el patrón de diseño MVC (Modelo-Vista-Controlador), organizando el código según su responsabilidad:</w:t>
+      </w:r>
+    </w:p>
+    <w:p>
+      <w:pPr>
+        <w:numPr>
+          <w:ilvl w:val="0"/>
+          <w:numId w:val="11"/>
+        </w:numPr>
+      </w:pPr>
+      <w:r>
+        <w:rPr>
+          <w:b/>
+          <w:bCs/>
+        </w:rPr>
+        <w:t>El Controlador Frontal (</w:t>
+      </w:r>
+      <w:proofErr w:type="spellStart"/>
+      <w:r>
+        <w:rPr>
+          <w:b/>
+          <w:bCs/>
+        </w:rPr>
+        <w:t>public</w:t>
+      </w:r>
+      <w:proofErr w:type="spellEnd"/>
+      <w:r>
+        <w:rPr>
+          <w:b/>
+          <w:bCs/>
+        </w:rPr>
+        <w:t>/</w:t>
+      </w:r>
+      <w:proofErr w:type="spellStart"/>
+      <w:r>
+        <w:rPr>
+          <w:b/>
+          <w:bCs/>
+        </w:rPr>
+        <w:t>index.php</w:t>
+      </w:r>
+      <w:proofErr w:type="spellEnd"/>
+      <w:r>
+        <w:rPr>
+          <w:b/>
+          <w:bCs/>
+        </w:rPr>
+        <w:t>):</w:t>
+      </w:r>
+      <w:r>
+        <w:t xml:space="preserve"> Es el punto de acceso único de la aplicación. Cualquier petición que haga el usuario a través del navegador pasa primero por este archivo. Su función principal es analizar la dirección web (URL), identificar qué acción está solicitando el usuario y delegar la tarea al Controlador correspondiente. Además, actúa como primera barrera de seguridad, comprobando el estado de la sesión antes de permitir el acceso a áreas restringidas (administradores).</w:t>
+      </w:r>
+    </w:p>
+    <w:p>
+      <w:pPr>
+        <w:numPr>
+          <w:ilvl w:val="0"/>
+          <w:numId w:val="11"/>
+        </w:numPr>
+      </w:pPr>
+      <w:r>
+        <w:rPr>
+          <w:b/>
+          <w:bCs/>
+        </w:rPr>
+        <w:t>El Controlador (</w:t>
+      </w:r>
+      <w:proofErr w:type="spellStart"/>
+      <w:r>
+        <w:rPr>
+          <w:b/>
+          <w:bCs/>
+        </w:rPr>
+        <w:t>src</w:t>
+      </w:r>
+      <w:proofErr w:type="spellEnd"/>
+      <w:r>
+        <w:rPr>
+          <w:b/>
+          <w:bCs/>
+        </w:rPr>
+        <w:t>/</w:t>
+      </w:r>
+      <w:proofErr w:type="spellStart"/>
+      <w:r>
+        <w:rPr>
+          <w:b/>
+          <w:bCs/>
+        </w:rPr>
+        <w:t>Controllers</w:t>
+      </w:r>
+      <w:proofErr w:type="spellEnd"/>
+      <w:r>
+        <w:rPr>
+          <w:b/>
+          <w:bCs/>
+        </w:rPr>
+        <w:t>/...):</w:t>
+      </w:r>
+      <w:r>
+        <w:t xml:space="preserve"> Es el coordinador lógico del proceso. Recibe las instrucciones del Controlador Frontal y organiza los pasos a seguir. Su labor es capturar la información, validarla, pasársela al Modelo para que la procese, y decidir qué pantalla (Vista) debe mostrarse. </w:t>
+      </w:r>
+    </w:p>
+    <w:p>
+      <w:pPr>
+        <w:numPr>
+          <w:ilvl w:val="0"/>
+          <w:numId w:val="11"/>
+        </w:numPr>
+      </w:pPr>
+      <w:r>
+        <w:rPr>
+          <w:b/>
+          <w:bCs/>
+        </w:rPr>
+        <w:lastRenderedPageBreak/>
+        <w:t>El Modelo (</w:t>
+      </w:r>
+      <w:proofErr w:type="spellStart"/>
+      <w:r>
+        <w:rPr>
+          <w:b/>
+          <w:bCs/>
+        </w:rPr>
+        <w:t>src</w:t>
+      </w:r>
+      <w:proofErr w:type="spellEnd"/>
+      <w:r>
+        <w:rPr>
+          <w:b/>
+          <w:bCs/>
+        </w:rPr>
+        <w:t>/</w:t>
+      </w:r>
+      <w:proofErr w:type="spellStart"/>
+      <w:r>
+        <w:rPr>
+          <w:b/>
+          <w:bCs/>
+        </w:rPr>
+        <w:t>Models</w:t>
+      </w:r>
+      <w:proofErr w:type="spellEnd"/>
+      <w:r>
+        <w:rPr>
+          <w:b/>
+          <w:bCs/>
+        </w:rPr>
+        <w:t>/...):</w:t>
+      </w:r>
+      <w:r>
+        <w:t xml:space="preserve"> Es el gestor de los datos. Es la única capa del sistema que se comunica con la base de datos (MySQL). Mediante conexiones seguras, ejecuta las consultas necesarias para guardar, actualizar, eliminar o extraer información sobre productos, usuarios o pedidos registrados.</w:t>
+      </w:r>
+    </w:p>
+    <w:p>
+      <w:pPr>
+        <w:numPr>
+          <w:ilvl w:val="0"/>
+          <w:numId w:val="11"/>
+        </w:numPr>
+      </w:pPr>
+      <w:r>
+        <w:rPr>
+          <w:b/>
+          <w:bCs/>
+        </w:rPr>
+        <w:t>La Vista (</w:t>
+      </w:r>
+      <w:proofErr w:type="spellStart"/>
+      <w:r>
+        <w:rPr>
+          <w:b/>
+          <w:bCs/>
+        </w:rPr>
+        <w:t>src</w:t>
+      </w:r>
+      <w:proofErr w:type="spellEnd"/>
+      <w:r>
+        <w:rPr>
+          <w:b/>
+          <w:bCs/>
+        </w:rPr>
+        <w:t>/</w:t>
+      </w:r>
+      <w:proofErr w:type="spellStart"/>
+      <w:r>
+        <w:rPr>
+          <w:b/>
+          <w:bCs/>
+        </w:rPr>
+        <w:t>views</w:t>
+      </w:r>
+      <w:proofErr w:type="spellEnd"/>
+      <w:r>
+        <w:rPr>
+          <w:b/>
+          <w:bCs/>
+        </w:rPr>
+        <w:t>/...):</w:t>
+      </w:r>
+      <w:r>
+        <w:t xml:space="preserve"> Es la interfaz visual. Son los archivos de diseño estructurados con HTML y Bootstrap. Su misión es exclusiva de presentación: reciben la información procesada por el Controlador y la muestran en pantalla. Se adaptan dinámicamente según el contexto (por ejemplo, mostrando botones de gestión de catálogo únicamente si el usuario identificado es un administrador).</w:t>
+      </w:r>
+    </w:p>
+    <w:p>
+      <w:pPr>
+        <w:pStyle w:val="Ttulo3"/>
+        <w:numPr>
+          <w:ilvl w:val="0"/>
+          <w:numId w:val="15"/>
+        </w:numPr>
+      </w:pPr>
+      <w:r>
+        <w:t>Funcionamiento Práctico y Módulos del Sistema</w:t>
+      </w:r>
+    </w:p>
+    <w:p>
+      <w:r>
+        <w:t>Para comprender la comunicación entre estos componentes, el funcionamiento de la plataforma se divide en tres grandes módulos lógicos:</w:t>
+      </w:r>
+    </w:p>
+    <w:p>
+      <w:pPr>
+        <w:rPr>
+          <w:b/>
+          <w:bCs/>
+        </w:rPr>
+      </w:pPr>
+      <w:r>
+        <w:rPr>
+          <w:b/>
+          <w:bCs/>
+        </w:rPr>
+        <w:t>A. Gestión Integral del Catálogo (Operaciones CRUD)</w:t>
+      </w:r>
+    </w:p>
+    <w:p>
+      <w:r>
+        <w:t>La administración de los artículos (Crear, Leer, Actualizar y Borrar) sigue un flujo estricto de validación y seguridad:</w:t>
+      </w:r>
+    </w:p>
+    <w:p>
+      <w:pPr>
+        <w:numPr>
+          <w:ilvl w:val="0"/>
+          <w:numId w:val="12"/>
+        </w:numPr>
+      </w:pPr>
+      <w:r>
+        <w:rPr>
+          <w:b/>
+          <w:bCs/>
+        </w:rPr>
+        <w:t>Creación y Lectura:</w:t>
+      </w:r>
+      <w:r>
+        <w:t xml:space="preserve"> Cuando un administrador registra un nuevo artículo, los datos se validan instantáneamente en el navegador del cliente mediante JavaScript (asegurando formatos correctos y evitando envíos vacíos). Al llegar al servidor, el Controlador agrupa los datos y el Modelo los inserta en la base de datos utilizando "sentencias preparadas". Este método garantiza que el texto introducido sea tratado estrictamente como texto, neutralizando cualquier intento de inyección de código malicioso. Posteriormente, la Vista lee la base de datos y muestra el catálogo actualizado.</w:t>
+      </w:r>
+    </w:p>
+    <w:p>
+      <w:pPr>
+        <w:numPr>
+          <w:ilvl w:val="0"/>
+          <w:numId w:val="12"/>
+        </w:numPr>
+      </w:pPr>
+      <w:r>
+        <w:rPr>
+          <w:b/>
+          <w:bCs/>
+        </w:rPr>
+        <w:t>Actualización (</w:t>
+      </w:r>
+      <w:proofErr w:type="spellStart"/>
+      <w:r>
+        <w:rPr>
+          <w:b/>
+          <w:bCs/>
+        </w:rPr>
+        <w:t>Update</w:t>
+      </w:r>
+      <w:proofErr w:type="spellEnd"/>
+      <w:r>
+        <w:rPr>
+          <w:b/>
+          <w:bCs/>
+        </w:rPr>
+        <w:t>):</w:t>
+      </w:r>
+      <w:r>
+        <w:t xml:space="preserve"> Para modificar un artículo existente, el sistema recupera la información actual desde el Modelo y la precarga en un formulario. Al confirmar los cambios, el Controlador procesa los nuevos valores y el Modelo </w:t>
+      </w:r>
+      <w:proofErr w:type="spellStart"/>
+      <w:r>
+        <w:t>sobreescribe</w:t>
+      </w:r>
+      <w:proofErr w:type="spellEnd"/>
+      <w:r>
+        <w:t xml:space="preserve"> únicamente ese registro específico en la base de datos.</w:t>
+      </w:r>
+    </w:p>
+    <w:p>
+      <w:pPr>
+        <w:numPr>
+          <w:ilvl w:val="0"/>
+          <w:numId w:val="12"/>
+        </w:numPr>
+      </w:pPr>
+      <w:r>
+        <w:rPr>
+          <w:b/>
+          <w:bCs/>
+        </w:rPr>
+        <w:t>Borrado (</w:t>
+      </w:r>
+      <w:proofErr w:type="spellStart"/>
+      <w:r>
+        <w:rPr>
+          <w:b/>
+          <w:bCs/>
+        </w:rPr>
+        <w:t>Delete</w:t>
+      </w:r>
+      <w:proofErr w:type="spellEnd"/>
+      <w:r>
+        <w:rPr>
+          <w:b/>
+          <w:bCs/>
+        </w:rPr>
+        <w:t>):</w:t>
+      </w:r>
+      <w:r>
+        <w:t xml:space="preserve"> Al solicitar la eliminación de un producto, la interfaz exige una confirmación previa para evitar acciones accidentales. Tras confirmar, el </w:t>
+      </w:r>
+      <w:r>
+        <w:lastRenderedPageBreak/>
+        <w:t>Controlador ordena al Modelo la eliminación del registro de la base de datos, refrescando la vista del catálogo de forma inmediata.</w:t>
+      </w:r>
+      <w:r>
+        <w:t xml:space="preserve"> </w:t>
+      </w:r>
+      <w:r>
+        <w:rPr>
+          <w:color w:val="FF0000"/>
+        </w:rPr>
+        <w:t>(en desarrollo)</w:t>
+      </w:r>
+    </w:p>
+    <w:p>
+      <w:pPr>
+        <w:pStyle w:val="Ttulo3"/>
+        <w:numPr>
+          <w:ilvl w:val="0"/>
+          <w:numId w:val="15"/>
+        </w:numPr>
+      </w:pPr>
+      <w:r>
+        <w:t>Sistema de Autenticación y Seguridad</w:t>
+      </w:r>
+    </w:p>
+    <w:p>
+      <w:pPr>
+        <w:rPr>
+          <w:color w:val="FF0000"/>
+        </w:rPr>
+      </w:pPr>
+      <w:r>
+        <w:rPr>
+          <w:color w:val="FF0000"/>
+        </w:rPr>
+        <w:t>En desarrollo.</w:t>
+      </w:r>
+    </w:p>
+    <w:p>
+      <w:r>
+        <w:t>La plataforma incorpora</w:t>
+      </w:r>
+      <w:r>
+        <w:t>rá</w:t>
+      </w:r>
+      <w:r>
+        <w:t xml:space="preserve"> un sistema de control de acceso para diferenciar entre clientes públicos y administradores de la tienda.</w:t>
+      </w:r>
+    </w:p>
+    <w:p>
+      <w:pPr>
+        <w:numPr>
+          <w:ilvl w:val="0"/>
+          <w:numId w:val="13"/>
+        </w:numPr>
+      </w:pPr>
+      <w:r>
+        <w:t>El proceso se gestiona mediante sesiones seguras en el servidor ($_SESSION).</w:t>
+      </w:r>
+    </w:p>
+    <w:p>
+      <w:pPr>
+        <w:numPr>
+          <w:ilvl w:val="0"/>
+          <w:numId w:val="13"/>
+        </w:numPr>
+      </w:pPr>
+      <w:r>
+        <w:t xml:space="preserve">Cuando un administrador intenta acceder al panel de gestión, el Modelo verifica sus credenciales comparando la contraseña introducida con un </w:t>
+      </w:r>
+      <w:r>
+        <w:rPr>
+          <w:i/>
+          <w:iCs/>
+        </w:rPr>
+        <w:t>hash</w:t>
+      </w:r>
+      <w:r>
+        <w:t xml:space="preserve"> (texto encriptado) almacenado en la base de datos.</w:t>
+      </w:r>
+    </w:p>
+    <w:p>
+      <w:pPr>
+        <w:numPr>
+          <w:ilvl w:val="0"/>
+          <w:numId w:val="13"/>
+        </w:numPr>
+      </w:pPr>
+      <w:r>
+        <w:t>Si la validación es exitosa, el sistema genera una sesión activa. Esto permite al Controlador Frontal habilitar las rutas de administración (añadir, editar o borrar productos), asegurando que los visitantes estándar únicamente tengan permisos para visualizar el catálogo y realizar compras.</w:t>
+      </w:r>
+    </w:p>
+    <w:p>
+      <w:pPr>
+        <w:pStyle w:val="Ttulo3"/>
+        <w:numPr>
+          <w:ilvl w:val="0"/>
+          <w:numId w:val="15"/>
+        </w:numPr>
+      </w:pPr>
+      <w:r>
+        <w:t>Carrito de la Compra y Sistema de Pago</w:t>
+      </w:r>
+    </w:p>
+    <w:p>
+      <w:pPr>
+        <w:rPr>
+          <w:color w:val="FF0000"/>
+        </w:rPr>
+      </w:pPr>
+      <w:r>
+        <w:rPr>
+          <w:color w:val="FF0000"/>
+        </w:rPr>
+        <w:t>En desarrollo.</w:t>
+      </w:r>
+    </w:p>
+    <w:p>
+      <w:r>
+        <w:t>El flujo principal de comercio electrónico permite a los clientes adquirir los productos de los artesanos mediante un proceso guiado:</w:t>
+      </w:r>
+    </w:p>
+    <w:p>
+      <w:pPr>
+        <w:numPr>
+          <w:ilvl w:val="0"/>
+          <w:numId w:val="14"/>
+        </w:numPr>
+      </w:pPr>
+      <w:r>
+        <w:rPr>
+          <w:b/>
+          <w:bCs/>
+        </w:rPr>
+        <w:t>Selección de artículos:</w:t>
+      </w:r>
+      <w:r>
+        <w:t xml:space="preserve"> Cuando un cliente añade productos, el Controlador los almacena temporalmente en un "carrito virtual" vinculado a la sesión activa del usuario, sin necesidad de interactuar constantemente con la base de datos.</w:t>
+      </w:r>
+    </w:p>
+    <w:p>
+      <w:pPr>
+        <w:numPr>
+          <w:ilvl w:val="0"/>
+          <w:numId w:val="14"/>
+        </w:numPr>
+      </w:pPr>
+      <w:r>
+        <w:rPr>
+          <w:b/>
+          <w:bCs/>
+        </w:rPr>
+        <w:t>Procesamiento y Pago:</w:t>
+      </w:r>
+      <w:r>
+        <w:t xml:space="preserve"> Al proceder a la compra, el sistema recopila los artículos del carrito, calcula los totales (incluyendo impuestos) y presenta un resumen detallado junto con el formulario de la pasarela de pago.</w:t>
+      </w:r>
+    </w:p>
+    <w:p>
+      <w:pPr>
+        <w:numPr>
+          <w:ilvl w:val="0"/>
+          <w:numId w:val="14"/>
+        </w:numPr>
+      </w:pPr>
+      <w:r>
+        <w:rPr>
+          <w:b/>
+          <w:bCs/>
+        </w:rPr>
+        <w:t>Confirmación del Pedido:</w:t>
+      </w:r>
+      <w:r>
+        <w:t xml:space="preserve"> Una vez verificado el pago, el Controlador ordena al Modelo que registre el pedido definitivo en la base de datos. En esta misma transacción, el sistema descuenta automáticamente el </w:t>
+      </w:r>
+      <w:r>
+        <w:rPr>
+          <w:i/>
+          <w:iCs/>
+        </w:rPr>
+        <w:t>stock</w:t>
+      </w:r>
+      <w:r>
+        <w:t xml:space="preserve"> de los productos </w:t>
+      </w:r>
+      <w:r>
+        <w:lastRenderedPageBreak/>
+        <w:t>adquiridos para mantener el inventario sincronizado, finalizando el proceso con la emisión de un comprobante para el cliente.</w:t>
+      </w:r>
+    </w:p>
+    <w:p/>
+    <w:p/>
+    <w:p/>
+    <w:p/>
+    <w:p/>
+    <w:p/>
+    <w:p/>
+    <w:p/>
+    <w:p/>
     <w:p/>
     <w:p/>
     <w:p/>
@@ -559,8 +1167,6 @@
         <w:t>PRIMERA PARTE.</w:t>
       </w:r>
     </w:p>
-    <w:p/>
-    <w:p/>
     <w:p>
       <w:pPr>
         <w:pStyle w:val="Ttulo2"/>
@@ -646,6 +1252,7 @@
       <w:r>
         <w:t xml:space="preserve">Por otro lado, hemos utilizado </w:t>
       </w:r>
+      <w:proofErr w:type="spellStart"/>
       <w:r>
         <w:rPr>
           <w:b/>
@@ -653,14 +1260,31 @@
         </w:rPr>
         <w:t>composer</w:t>
       </w:r>
-      <w:r>
-        <w:t xml:space="preserve"> para que gestione directamente el autoload y evitar estar utili</w:t>
+      <w:proofErr w:type="spellEnd"/>
+      <w:r>
+        <w:t xml:space="preserve"> para que gestione directamente el </w:t>
+      </w:r>
+      <w:proofErr w:type="spellStart"/>
+      <w:r>
+        <w:t>autoload</w:t>
+      </w:r>
+      <w:proofErr w:type="spellEnd"/>
+      <w:r>
+        <w:t xml:space="preserve"> y evitar estar utili</w:t>
       </w:r>
       <w:r>
         <w:t>z</w:t>
       </w:r>
       <w:r>
-        <w:t xml:space="preserve">ando require en cada una de las páginas. </w:t>
+        <w:t xml:space="preserve">ando </w:t>
+      </w:r>
+      <w:proofErr w:type="spellStart"/>
+      <w:r>
+        <w:t>require</w:t>
+      </w:r>
+      <w:proofErr w:type="spellEnd"/>
+      <w:r>
+        <w:t xml:space="preserve"> en cada una de las páginas. </w:t>
       </w:r>
     </w:p>
     <w:p/>
@@ -680,12 +1304,21 @@
       <w:r>
         <w:t xml:space="preserve">Dentro de </w:t>
       </w:r>
-      <w:r>
-        <w:rPr>
-          <w:b/>
-          <w:bCs/>
-        </w:rPr>
-        <w:t>src:</w:t>
+      <w:proofErr w:type="spellStart"/>
+      <w:r>
+        <w:rPr>
+          <w:b/>
+          <w:bCs/>
+        </w:rPr>
+        <w:t>src</w:t>
+      </w:r>
+      <w:proofErr w:type="spellEnd"/>
+      <w:r>
+        <w:rPr>
+          <w:b/>
+          <w:bCs/>
+        </w:rPr>
+        <w:t>:</w:t>
       </w:r>
     </w:p>
     <w:p>
@@ -696,6 +1329,7 @@
           <w:numId w:val="2"/>
         </w:numPr>
       </w:pPr>
+      <w:proofErr w:type="spellStart"/>
       <w:r>
         <w:rPr>
           <w:b/>
@@ -703,11 +1337,28 @@
         </w:rPr>
         <w:t>config</w:t>
       </w:r>
+      <w:proofErr w:type="spellEnd"/>
       <w:r>
         <w:t>: Archivos de configuración</w:t>
       </w:r>
       <w:r>
-        <w:t>. Por ejemplo un archivo conexión.php para la conexión con la BBDD usando PDO (Lo aprendido en DWES).</w:t>
+        <w:t xml:space="preserve">. Por </w:t>
+      </w:r>
+      <w:proofErr w:type="gramStart"/>
+      <w:r>
+        <w:t>ejemplo</w:t>
+      </w:r>
+      <w:proofErr w:type="gramEnd"/>
+      <w:r>
+        <w:t xml:space="preserve"> un archivo </w:t>
+      </w:r>
+      <w:proofErr w:type="spellStart"/>
+      <w:r>
+        <w:t>conexión.php</w:t>
+      </w:r>
+      <w:proofErr w:type="spellEnd"/>
+      <w:r>
+        <w:t xml:space="preserve"> para la conexión con la BBDD usando PDO (Lo aprendido en DWES).</w:t>
       </w:r>
     </w:p>
     <w:p>
@@ -718,6 +1369,7 @@
           <w:numId w:val="2"/>
         </w:numPr>
       </w:pPr>
+      <w:proofErr w:type="spellStart"/>
       <w:r>
         <w:rPr>
           <w:b/>
@@ -732,6 +1384,7 @@
         </w:rPr>
         <w:t>ontrollers</w:t>
       </w:r>
+      <w:proofErr w:type="spellEnd"/>
       <w:r>
         <w:t>: Lógica de la aplicación.</w:t>
       </w:r>
@@ -747,6 +1400,7 @@
           <w:numId w:val="2"/>
         </w:numPr>
       </w:pPr>
+      <w:proofErr w:type="spellStart"/>
       <w:r>
         <w:rPr>
           <w:b/>
@@ -754,6 +1408,7 @@
         </w:rPr>
         <w:t>models</w:t>
       </w:r>
+      <w:proofErr w:type="spellEnd"/>
       <w:r>
         <w:t>: Interacción con la base de datos</w:t>
       </w:r>
@@ -769,6 +1424,7 @@
           <w:numId w:val="2"/>
         </w:numPr>
       </w:pPr>
+      <w:proofErr w:type="spellStart"/>
       <w:r>
         <w:rPr>
           <w:b/>
@@ -776,6 +1432,7 @@
         </w:rPr>
         <w:t>views</w:t>
       </w:r>
+      <w:proofErr w:type="spellEnd"/>
       <w:r>
         <w:t>: Plantillas de visualización (HTML/PHP).</w:t>
       </w:r>
@@ -800,6 +1457,7 @@
           <w:numId w:val="2"/>
         </w:numPr>
       </w:pPr>
+      <w:proofErr w:type="spellStart"/>
       <w:r>
         <w:rPr>
           <w:b/>
@@ -807,6 +1465,7 @@
         </w:rPr>
         <w:t>public</w:t>
       </w:r>
+      <w:proofErr w:type="spellEnd"/>
       <w:r>
         <w:t xml:space="preserve">: </w:t>
       </w:r>
@@ -839,11 +1498,33 @@
           <w:lang w:val="en-US"/>
         </w:rPr>
       </w:pPr>
+      <w:proofErr w:type="spellStart"/>
       <w:r>
         <w:rPr>
           <w:lang w:val="en-US"/>
         </w:rPr>
-        <w:t>Index.php (el front controller).</w:t>
+        <w:t>Index.php</w:t>
+      </w:r>
+      <w:proofErr w:type="spellEnd"/>
+      <w:r>
+        <w:rPr>
+          <w:lang w:val="en-US"/>
+        </w:rPr>
+        <w:t xml:space="preserve"> (</w:t>
+      </w:r>
+      <w:proofErr w:type="spellStart"/>
+      <w:r>
+        <w:rPr>
+          <w:lang w:val="en-US"/>
+        </w:rPr>
+        <w:t>el</w:t>
+      </w:r>
+      <w:proofErr w:type="spellEnd"/>
+      <w:r>
+        <w:rPr>
+          <w:lang w:val="en-US"/>
+        </w:rPr>
+        <w:t xml:space="preserve"> front controller).</w:t>
       </w:r>
     </w:p>
     <w:p>
@@ -862,8 +1543,17 @@
           <w:b/>
           <w:bCs/>
         </w:rPr>
-        <w:t>/css</w:t>
-      </w:r>
+        <w:t>/</w:t>
+      </w:r>
+      <w:proofErr w:type="spellStart"/>
+      <w:r>
+        <w:rPr>
+          <w:b/>
+          <w:bCs/>
+        </w:rPr>
+        <w:t>css</w:t>
+      </w:r>
+      <w:proofErr w:type="spellEnd"/>
       <w:r>
         <w:t xml:space="preserve">, </w:t>
       </w:r>
@@ -872,8 +1562,17 @@
           <w:b/>
           <w:bCs/>
         </w:rPr>
-        <w:t>/js</w:t>
-      </w:r>
+        <w:t>/</w:t>
+      </w:r>
+      <w:proofErr w:type="spellStart"/>
+      <w:r>
+        <w:rPr>
+          <w:b/>
+          <w:bCs/>
+        </w:rPr>
+        <w:t>js</w:t>
+      </w:r>
+      <w:proofErr w:type="spellEnd"/>
       <w:r>
         <w:t xml:space="preserve">, </w:t>
       </w:r>
@@ -882,8 +1581,17 @@
           <w:b/>
           <w:bCs/>
         </w:rPr>
-        <w:t>/img</w:t>
-      </w:r>
+        <w:t>/</w:t>
+      </w:r>
+      <w:proofErr w:type="spellStart"/>
+      <w:r>
+        <w:rPr>
+          <w:b/>
+          <w:bCs/>
+        </w:rPr>
+        <w:t>img</w:t>
+      </w:r>
+      <w:proofErr w:type="spellEnd"/>
       <w:r>
         <w:rPr>
           <w:b/>
@@ -901,12 +1609,29 @@
         <w:pStyle w:val="Ttulo2"/>
       </w:pPr>
       <w:r>
-        <w:t>Sincronización con github (sistema de control de versiones).</w:t>
-      </w:r>
-    </w:p>
-    <w:p>
-      <w:r>
-        <w:t>De manera breve explico la sincronización llevada a cabo con github, así como indico el acceso al repositorio público.</w:t>
+        <w:lastRenderedPageBreak/>
+        <w:t xml:space="preserve">Sincronización con </w:t>
+      </w:r>
+      <w:proofErr w:type="spellStart"/>
+      <w:r>
+        <w:t>github</w:t>
+      </w:r>
+      <w:proofErr w:type="spellEnd"/>
+      <w:r>
+        <w:t xml:space="preserve"> (sistema de control de versiones).</w:t>
+      </w:r>
+    </w:p>
+    <w:p>
+      <w:r>
+        <w:t xml:space="preserve">De manera breve explico la sincronización llevada a cabo con </w:t>
+      </w:r>
+      <w:proofErr w:type="spellStart"/>
+      <w:r>
+        <w:t>github</w:t>
+      </w:r>
+      <w:proofErr w:type="spellEnd"/>
+      <w:r>
+        <w:t>, así como indico el acceso al repositorio público.</w:t>
       </w:r>
     </w:p>
     <w:p>
@@ -921,7 +1646,31 @@
         </w:rPr>
       </w:pPr>
       <w:r>
-        <w:t>Inicio git init en mi pc para crear repositorio git.</w:t>
+        <w:t xml:space="preserve">Inicio </w:t>
+      </w:r>
+      <w:proofErr w:type="spellStart"/>
+      <w:r>
+        <w:t>git</w:t>
+      </w:r>
+      <w:proofErr w:type="spellEnd"/>
+      <w:r>
+        <w:t xml:space="preserve"> </w:t>
+      </w:r>
+      <w:proofErr w:type="spellStart"/>
+      <w:r>
+        <w:t>init</w:t>
+      </w:r>
+      <w:proofErr w:type="spellEnd"/>
+      <w:r>
+        <w:t xml:space="preserve"> en mi pc para crear repositorio </w:t>
+      </w:r>
+      <w:proofErr w:type="spellStart"/>
+      <w:r>
+        <w:t>git</w:t>
+      </w:r>
+      <w:proofErr w:type="spellEnd"/>
+      <w:r>
+        <w:t>.</w:t>
       </w:r>
       <w:r>
         <w:rPr>
@@ -942,8 +1691,26 @@
           <w:bCs/>
         </w:rPr>
       </w:pPr>
-      <w:r>
-        <w:t>Creo .gitignore para evitar que se sincronice todo el composer.</w:t>
+      <w:proofErr w:type="gramStart"/>
+      <w:r>
+        <w:t>Creo .</w:t>
+      </w:r>
+      <w:proofErr w:type="spellStart"/>
+      <w:r>
+        <w:t>gitignore</w:t>
+      </w:r>
+      <w:proofErr w:type="spellEnd"/>
+      <w:proofErr w:type="gramEnd"/>
+      <w:r>
+        <w:t xml:space="preserve"> para evitar que se sincronice todo el </w:t>
+      </w:r>
+      <w:proofErr w:type="spellStart"/>
+      <w:r>
+        <w:t>composer</w:t>
+      </w:r>
+      <w:proofErr w:type="spellEnd"/>
+      <w:r>
+        <w:t>.</w:t>
       </w:r>
     </w:p>
     <w:p>
@@ -957,7 +1724,15 @@
         </w:rPr>
       </w:pPr>
       <w:r>
-        <w:t xml:space="preserve">Vincular repositorio remoto a github: </w:t>
+        <w:t xml:space="preserve">Vincular repositorio remoto a </w:t>
+      </w:r>
+      <w:proofErr w:type="spellStart"/>
+      <w:r>
+        <w:t>github</w:t>
+      </w:r>
+      <w:proofErr w:type="spellEnd"/>
+      <w:r>
+        <w:t xml:space="preserve">: </w:t>
       </w:r>
       <w:r>
         <w:rPr>
@@ -983,7 +1758,23 @@
         </w:numPr>
       </w:pPr>
       <w:r>
-        <w:t>Renombrar la rama a “main”, la nueva barra de github.</w:t>
+        <w:t>Renombrar la rama a “</w:t>
+      </w:r>
+      <w:proofErr w:type="spellStart"/>
+      <w:r>
+        <w:t>main</w:t>
+      </w:r>
+      <w:proofErr w:type="spellEnd"/>
+      <w:r>
+        <w:t xml:space="preserve">”, la nueva barra de </w:t>
+      </w:r>
+      <w:proofErr w:type="spellStart"/>
+      <w:r>
+        <w:t>github</w:t>
+      </w:r>
+      <w:proofErr w:type="spellEnd"/>
+      <w:r>
+        <w:t>.</w:t>
       </w:r>
     </w:p>
     <w:p>
@@ -994,18 +1785,42 @@
         </w:numPr>
       </w:pPr>
       <w:r>
-        <w:t>Subir los archivos a la nube:  git push -u origin main</w:t>
-      </w:r>
+        <w:t xml:space="preserve">Subir los archivos a la nube:  </w:t>
+      </w:r>
+      <w:proofErr w:type="spellStart"/>
+      <w:r>
+        <w:t>git</w:t>
+      </w:r>
+      <w:proofErr w:type="spellEnd"/>
+      <w:r>
+        <w:t xml:space="preserve"> </w:t>
+      </w:r>
+      <w:proofErr w:type="spellStart"/>
+      <w:r>
+        <w:t>push</w:t>
+      </w:r>
+      <w:proofErr w:type="spellEnd"/>
+      <w:r>
+        <w:t xml:space="preserve"> -u </w:t>
+      </w:r>
+      <w:proofErr w:type="spellStart"/>
+      <w:r>
+        <w:t>origin</w:t>
+      </w:r>
+      <w:proofErr w:type="spellEnd"/>
+      <w:r>
+        <w:t xml:space="preserve"> </w:t>
+      </w:r>
+      <w:proofErr w:type="spellStart"/>
+      <w:r>
+        <w:t>main</w:t>
+      </w:r>
+      <w:proofErr w:type="spellEnd"/>
     </w:p>
     <w:p>
       <w:pPr>
         <w:pStyle w:val="Ttulo2"/>
       </w:pPr>
-    </w:p>
-    <w:p>
-      <w:pPr>
-        <w:pStyle w:val="Ttulo2"/>
-      </w:pPr>
       <w:r>
         <w:t>La estructura y la creación de la BBDD</w:t>
       </w:r>
@@ -1033,7 +1848,15 @@
         </w:rPr>
       </w:pPr>
       <w:r>
-        <w:t xml:space="preserve">He dejado el archivo .sql de la base de datos </w:t>
+        <w:t>He dejado el archivo .</w:t>
+      </w:r>
+      <w:proofErr w:type="spellStart"/>
+      <w:r>
+        <w:t>sql</w:t>
+      </w:r>
+      <w:proofErr w:type="spellEnd"/>
+      <w:r>
+        <w:t xml:space="preserve"> de la base de datos </w:t>
       </w:r>
       <w:r>
         <w:rPr>
@@ -1057,8 +1880,49 @@
           <w:b/>
           <w:bCs/>
         </w:rPr>
-        <w:t>/src/database/artesanos_db.sql</w:t>
-      </w:r>
+        <w:t>/</w:t>
+      </w:r>
+      <w:proofErr w:type="spellStart"/>
+      <w:r>
+        <w:rPr>
+          <w:b/>
+          <w:bCs/>
+        </w:rPr>
+        <w:t>src</w:t>
+      </w:r>
+      <w:proofErr w:type="spellEnd"/>
+      <w:r>
+        <w:rPr>
+          <w:b/>
+          <w:bCs/>
+        </w:rPr>
+        <w:t>/</w:t>
+      </w:r>
+      <w:proofErr w:type="spellStart"/>
+      <w:r>
+        <w:rPr>
+          <w:b/>
+          <w:bCs/>
+        </w:rPr>
+        <w:t>database</w:t>
+      </w:r>
+      <w:proofErr w:type="spellEnd"/>
+      <w:r>
+        <w:rPr>
+          <w:b/>
+          <w:bCs/>
+        </w:rPr>
+        <w:t>/</w:t>
+      </w:r>
+      <w:proofErr w:type="spellStart"/>
+      <w:r>
+        <w:rPr>
+          <w:b/>
+          <w:bCs/>
+        </w:rPr>
+        <w:t>artesanos_db.sql</w:t>
+      </w:r>
+      <w:proofErr w:type="spellEnd"/>
     </w:p>
     <w:p>
       <w:r>
@@ -1066,7 +1930,7 @@
           <w:noProof/>
         </w:rPr>
         <w:drawing>
-          <wp:anchor distT="0" distB="0" distL="114300" distR="114300" simplePos="0" relativeHeight="251662336" behindDoc="0" locked="0" layoutInCell="1" allowOverlap="1" wp14:anchorId="1A5EBA18" wp14:editId="7AB04C97">
+          <wp:anchor distT="0" distB="0" distL="114300" distR="114300" simplePos="0" relativeHeight="251662336" behindDoc="0" locked="0" layoutInCell="1" allowOverlap="1" wp14:anchorId="1A5EBA18" wp14:editId="10CC752A">
             <wp:simplePos x="0" y="0"/>
             <wp:positionH relativeFrom="column">
               <wp:posOffset>2516920</wp:posOffset>
@@ -1122,7 +1986,15 @@
         </w:drawing>
       </w:r>
       <w:r>
-        <w:t>Para importarla, yo lo hago desde PHPMyAdmin, tal como hicimos en el curso. Adjunto una captura</w:t>
+        <w:t xml:space="preserve">Para importarla, yo lo hago desde </w:t>
+      </w:r>
+      <w:proofErr w:type="spellStart"/>
+      <w:r>
+        <w:t>PHPMyAdmin</w:t>
+      </w:r>
+      <w:proofErr w:type="spellEnd"/>
+      <w:r>
+        <w:t>, tal como hicimos en el curso. Adjunto una captura</w:t>
       </w:r>
       <w:r>
         <w:t>.</w:t>
@@ -1198,18 +2070,41 @@
       </w:r>
     </w:p>
     <w:p/>
+    <w:p/>
+    <w:p/>
+    <w:p/>
+    <w:p/>
+    <w:p/>
+    <w:p/>
+    <w:p/>
+    <w:p/>
+    <w:p/>
+    <w:p/>
+    <w:p/>
+    <w:p/>
+    <w:p/>
+    <w:p/>
     <w:p>
       <w:pPr>
         <w:pStyle w:val="Ttulo2"/>
       </w:pPr>
       <w:r>
-        <w:t>La conexión a la Base de datos. “Conexión.php”</w:t>
+        <w:t>La conexión a la Base de datos. “</w:t>
+      </w:r>
+      <w:proofErr w:type="spellStart"/>
+      <w:r>
+        <w:t>Conexión.php</w:t>
+      </w:r>
+      <w:proofErr w:type="spellEnd"/>
+      <w:r>
+        <w:t>”</w:t>
       </w:r>
     </w:p>
     <w:p>
       <w:r>
         <w:t xml:space="preserve">Dado que usamos </w:t>
       </w:r>
+      <w:proofErr w:type="spellStart"/>
       <w:r>
         <w:rPr>
           <w:b/>
@@ -1217,13 +2112,70 @@
         </w:rPr>
         <w:t>composer</w:t>
       </w:r>
-      <w:r>
-        <w:t xml:space="preserve"> con el autoload para gestionar las librerías, podemos simplificar el crear la conexión y usar un require_once en cada página que vaya a querer usarla. Para ello indicamos que el archivo de conexión está en la carpeta config, dentro de src.</w:t>
-      </w:r>
-    </w:p>
-    <w:p>
-      <w:r>
-        <w:t>Como en el autoload llamamos App a src, entonces App\config.</w:t>
+      <w:proofErr w:type="spellEnd"/>
+      <w:r>
+        <w:t xml:space="preserve"> con el </w:t>
+      </w:r>
+      <w:proofErr w:type="spellStart"/>
+      <w:r>
+        <w:t>autoload</w:t>
+      </w:r>
+      <w:proofErr w:type="spellEnd"/>
+      <w:r>
+        <w:t xml:space="preserve"> para gestionar las librerías, podemos simplificar el crear la conexión y usar un </w:t>
+      </w:r>
+      <w:proofErr w:type="spellStart"/>
+      <w:r>
+        <w:t>require_once</w:t>
+      </w:r>
+      <w:proofErr w:type="spellEnd"/>
+      <w:r>
+        <w:t xml:space="preserve"> en cada página que vaya a querer usarla. Para ello indicamos que el archivo de conexión está en la carpeta </w:t>
+      </w:r>
+      <w:proofErr w:type="spellStart"/>
+      <w:r>
+        <w:t>config</w:t>
+      </w:r>
+      <w:proofErr w:type="spellEnd"/>
+      <w:r>
+        <w:t xml:space="preserve">, dentro de </w:t>
+      </w:r>
+      <w:proofErr w:type="spellStart"/>
+      <w:r>
+        <w:t>src</w:t>
+      </w:r>
+      <w:proofErr w:type="spellEnd"/>
+      <w:r>
+        <w:t>.</w:t>
+      </w:r>
+    </w:p>
+    <w:p>
+      <w:r>
+        <w:t xml:space="preserve">Como en el </w:t>
+      </w:r>
+      <w:proofErr w:type="spellStart"/>
+      <w:r>
+        <w:t>autoload</w:t>
+      </w:r>
+      <w:proofErr w:type="spellEnd"/>
+      <w:r>
+        <w:t xml:space="preserve"> llamamos App a </w:t>
+      </w:r>
+      <w:proofErr w:type="spellStart"/>
+      <w:r>
+        <w:t>src</w:t>
+      </w:r>
+      <w:proofErr w:type="spellEnd"/>
+      <w:r>
+        <w:t>, entonces App\</w:t>
+      </w:r>
+      <w:proofErr w:type="spellStart"/>
+      <w:r>
+        <w:t>config</w:t>
+      </w:r>
+      <w:proofErr w:type="spellEnd"/>
+      <w:r>
+        <w:t>.</w:t>
       </w:r>
     </w:p>
     <w:p>
@@ -1231,25 +2183,64 @@
         <w:pStyle w:val="Ttulo2"/>
       </w:pPr>
       <w:r>
-        <w:t>Desarrollo de los Modelos (Carpeta models)</w:t>
-      </w:r>
-    </w:p>
-    <w:p>
-      <w:r>
-        <w:t xml:space="preserve">En el directorio src/models/, </w:t>
+        <w:t xml:space="preserve">Desarrollo de los Modelos (Carpeta </w:t>
+      </w:r>
+      <w:proofErr w:type="spellStart"/>
+      <w:r>
+        <w:t>models</w:t>
+      </w:r>
+      <w:proofErr w:type="spellEnd"/>
+      <w:r>
+        <w:t>)</w:t>
+      </w:r>
+    </w:p>
+    <w:p>
+      <w:r>
+        <w:t xml:space="preserve">En el directorio </w:t>
+      </w:r>
+      <w:proofErr w:type="spellStart"/>
+      <w:r>
+        <w:t>src</w:t>
+      </w:r>
+      <w:proofErr w:type="spellEnd"/>
+      <w:r>
+        <w:t>/</w:t>
+      </w:r>
+      <w:proofErr w:type="spellStart"/>
+      <w:r>
+        <w:t>models</w:t>
+      </w:r>
+      <w:proofErr w:type="spellEnd"/>
+      <w:r>
+        <w:t xml:space="preserve">/, </w:t>
       </w:r>
       <w:r>
         <w:t>tratamos de separar</w:t>
       </w:r>
       <w:r>
-        <w:t xml:space="preserve"> la lógica de persistencia de datos mediante la creación de una clase PHP por cada tabla de la base de datos relacional. El desarrollo ha comenzado con la clase Producto.php:</w:t>
-      </w:r>
-      <w:r>
-        <w:t xml:space="preserve">Empezamos con el </w:t>
-      </w:r>
-      <w:r>
-        <w:t>archivo Producto.php</w:t>
-      </w:r>
+        <w:t xml:space="preserve"> la lógica de persistencia de datos mediante la creación de una clase PHP por cada tabla de la base de datos relacional. El desarrollo ha comenzado con la clase </w:t>
+      </w:r>
+      <w:proofErr w:type="spellStart"/>
+      <w:proofErr w:type="gramStart"/>
+      <w:r>
+        <w:t>Producto.php:</w:t>
+      </w:r>
+      <w:r>
+        <w:t>Empezamos</w:t>
+      </w:r>
+      <w:proofErr w:type="spellEnd"/>
+      <w:proofErr w:type="gramEnd"/>
+      <w:r>
+        <w:t xml:space="preserve"> con el </w:t>
+      </w:r>
+      <w:r>
+        <w:t xml:space="preserve">archivo </w:t>
+      </w:r>
+      <w:proofErr w:type="spellStart"/>
+      <w:r>
+        <w:t>Producto.php</w:t>
+      </w:r>
+      <w:proofErr w:type="spellEnd"/>
       <w:r>
         <w:t>:</w:t>
       </w:r>
@@ -1273,7 +2264,15 @@
         <w:t>Método Constructor:</w:t>
       </w:r>
       <w:r>
-        <w:t xml:space="preserve"> Implementa la instanciación automática de la clase Conexion, abstrayendo el objeto PDO y almacenándolo en una propiedad </w:t>
+        <w:t xml:space="preserve"> Implementa la instanciación automática de la clase </w:t>
+      </w:r>
+      <w:proofErr w:type="spellStart"/>
+      <w:r>
+        <w:t>Conexion</w:t>
+      </w:r>
+      <w:proofErr w:type="spellEnd"/>
+      <w:r>
+        <w:t xml:space="preserve">, abstrayendo el objeto PDO y almacenándolo en una propiedad </w:t>
       </w:r>
       <w:r>
         <w:t>de clase</w:t>
@@ -1291,7 +2290,6 @@
         </w:numPr>
       </w:pPr>
       <w:r>
-        <w:lastRenderedPageBreak/>
         <w:t xml:space="preserve">  </w:t>
       </w:r>
       <w:r>
@@ -1299,7 +2297,32 @@
           <w:b/>
           <w:bCs/>
         </w:rPr>
-        <w:t>Método listarTodo():</w:t>
+        <w:t xml:space="preserve">Método </w:t>
+      </w:r>
+      <w:proofErr w:type="spellStart"/>
+      <w:proofErr w:type="gramStart"/>
+      <w:r>
+        <w:rPr>
+          <w:b/>
+          <w:bCs/>
+        </w:rPr>
+        <w:t>listarTodo</w:t>
+      </w:r>
+      <w:proofErr w:type="spellEnd"/>
+      <w:r>
+        <w:rPr>
+          <w:b/>
+          <w:bCs/>
+        </w:rPr>
+        <w:t>(</w:t>
+      </w:r>
+      <w:proofErr w:type="gramEnd"/>
+      <w:r>
+        <w:rPr>
+          <w:b/>
+          <w:bCs/>
+        </w:rPr>
+        <w:t>):</w:t>
       </w:r>
       <w:r>
         <w:t xml:space="preserve"> Encargado de interactuar con la base de datos para la extracción del catálogo completo. Se implementa mediante sentencias preparadas de PDO, ejecutando una consulta SELECT y retornando un array </w:t>
@@ -1313,7 +2336,20 @@
         </w:numPr>
       </w:pPr>
       <w:r>
-        <w:t>Desarrollamos el método listarTodo(), encargado de ejecutar la consulta SELECT mediante sentencias preparadas y retornar los datos en un array asociativo (PDO::FETCH_ASSOC).</w:t>
+        <w:t xml:space="preserve">Desarrollamos el método </w:t>
+      </w:r>
+      <w:proofErr w:type="spellStart"/>
+      <w:proofErr w:type="gramStart"/>
+      <w:r>
+        <w:t>listarTodo</w:t>
+      </w:r>
+      <w:proofErr w:type="spellEnd"/>
+      <w:r>
+        <w:t>(</w:t>
+      </w:r>
+      <w:proofErr w:type="gramEnd"/>
+      <w:r>
+        <w:t>), encargado de ejecutar la consulta SELECT mediante sentencias preparadas y retornar los datos en un array asociativo (PDO::FETCH_ASSOC).</w:t>
       </w:r>
     </w:p>
     <w:p>
@@ -1321,8 +2357,13 @@
         <w:pStyle w:val="Ttulo2"/>
       </w:pPr>
       <w:r>
-        <w:t>Verificación en el Front Controller</w:t>
-      </w:r>
+        <w:t xml:space="preserve">Verificación en el Front </w:t>
+      </w:r>
+      <w:proofErr w:type="spellStart"/>
+      <w:r>
+        <w:t>Controller</w:t>
+      </w:r>
+      <w:proofErr w:type="spellEnd"/>
       <w:r>
         <w:t xml:space="preserve"> ¿(lo meto en pruebas)?</w:t>
       </w:r>
@@ -1338,7 +2379,23 @@
         </w:rPr>
       </w:pPr>
       <w:r>
-        <w:t xml:space="preserve">Utilizamos el archivo public/index.php para realizar pruebas de integración. </w:t>
+        <w:t xml:space="preserve">Utilizamos el archivo </w:t>
+      </w:r>
+      <w:proofErr w:type="spellStart"/>
+      <w:r>
+        <w:t>public</w:t>
+      </w:r>
+      <w:proofErr w:type="spellEnd"/>
+      <w:r>
+        <w:t>/</w:t>
+      </w:r>
+      <w:proofErr w:type="spellStart"/>
+      <w:r>
+        <w:t>index.php</w:t>
+      </w:r>
+      <w:proofErr w:type="spellEnd"/>
+      <w:r>
+        <w:t xml:space="preserve"> para realizar pruebas de integración. </w:t>
       </w:r>
       <w:r>
         <w:t xml:space="preserve">De </w:t>
@@ -1356,7 +2413,16 @@
         <w:pStyle w:val="Ttulo2"/>
       </w:pPr>
       <w:r>
-        <w:t>Inicio del Controlador (Carpeta controllers)</w:t>
+        <w:lastRenderedPageBreak/>
+        <w:t xml:space="preserve">Inicio del Controlador (Carpeta </w:t>
+      </w:r>
+      <w:proofErr w:type="spellStart"/>
+      <w:r>
+        <w:t>controllers</w:t>
+      </w:r>
+      <w:proofErr w:type="spellEnd"/>
+      <w:r>
+        <w:t>)</w:t>
       </w:r>
     </w:p>
     <w:p>
@@ -1367,7 +2433,15 @@
         </w:numPr>
       </w:pPr>
       <w:r>
-        <w:t xml:space="preserve">Avanzamos hacia el directorio controllers para empezar a definir la lógica de la aplicación. </w:t>
+        <w:t xml:space="preserve">Avanzamos hacia el directorio </w:t>
+      </w:r>
+      <w:proofErr w:type="spellStart"/>
+      <w:r>
+        <w:t>controllers</w:t>
+      </w:r>
+      <w:proofErr w:type="spellEnd"/>
+      <w:r>
+        <w:t xml:space="preserve"> para empezar a definir la lógica de la aplicación. </w:t>
       </w:r>
     </w:p>
     <w:p>
@@ -1384,7 +2458,28 @@
         <w:t>creamos</w:t>
       </w:r>
       <w:r>
-        <w:t xml:space="preserve"> el archivo ProductoController.php con un método index() vacío, cuyo objetivo es pedir los datos al modelo para prepararlos antes de enviarlos a la vista.</w:t>
+        <w:t xml:space="preserve"> el archivo </w:t>
+      </w:r>
+      <w:proofErr w:type="spellStart"/>
+      <w:r>
+        <w:t>ProductoController.php</w:t>
+      </w:r>
+      <w:proofErr w:type="spellEnd"/>
+      <w:r>
+        <w:t xml:space="preserve"> con un método </w:t>
+      </w:r>
+      <w:proofErr w:type="spellStart"/>
+      <w:proofErr w:type="gramStart"/>
+      <w:r>
+        <w:t>index</w:t>
+      </w:r>
+      <w:proofErr w:type="spellEnd"/>
+      <w:r>
+        <w:t>(</w:t>
+      </w:r>
+      <w:proofErr w:type="gramEnd"/>
+      <w:r>
+        <w:t>) vacío, cuyo objetivo es pedir los datos al modelo para prepararlos antes de enviarlos a la vista.</w:t>
       </w:r>
     </w:p>
     <w:p/>
@@ -1401,6 +2496,155 @@
 <file path=word/numbering.xml><?xml version="1.0" encoding="utf-8"?>
 <w:numbering xmlns:wpc="http://schemas.microsoft.com/office/word/2010/wordprocessingCanvas" xmlns:cx="http://schemas.microsoft.com/office/drawing/2014/chartex" xmlns:cx1="http://schemas.microsoft.com/office/drawing/2015/9/8/chartex" xmlns:cx2="http://schemas.microsoft.com/office/drawing/2015/10/21/chartex" xmlns:cx3="http://schemas.microsoft.com/office/drawing/2016/5/9/chartex" xmlns:cx4="http://schemas.microsoft.com/office/drawing/2016/5/10/chartex" xmlns:cx5="http://schemas.microsoft.com/office/drawing/2016/5/11/chartex" xmlns:cx6="http://schemas.microsoft.com/office/drawing/2016/5/12/chartex" xmlns:cx7="http://schemas.microsoft.com/office/drawing/2016/5/13/chartex" xmlns:cx8="http://schemas.microsoft.com/office/drawing/2016/5/14/chartex" xmlns:mc="http://schemas.openxmlformats.org/markup-compatibility/2006" xmlns:aink="http://schemas.microsoft.com/office/drawing/2016/ink" xmlns:am3d="http://schemas.microsoft.com/office/drawing/2017/model3d" xmlns:o="urn:schemas-microsoft-com:office:office" xmlns:oel="http://schemas.microsoft.com/office/2019/extlst" xmlns:r="http://schemas.openxmlformats.org/officeDocument/2006/relationships" xmlns:m="http://schemas.openxmlformats.org/officeDocument/2006/math" xmlns:v="urn:schemas-microsoft-com:vml" xmlns:wp14="http://schemas.microsoft.com/office/word/2010/wordprocessingDrawing" xmlns:wp="http://schemas.openxmlformats.org/drawingml/2006/wordprocessingDrawing" xmlns:w10="urn:schemas-microsoft-com:office:word" xmlns:w="http://schemas.openxmlformats.org/wordprocessingml/2006/main" xmlns:w14="http://schemas.microsoft.com/office/word/2010/wordml" xmlns:w15="http://schemas.microsoft.com/office/word/2012/wordml" xmlns:w16cex="http://schemas.microsoft.com/office/word/2018/wordml/cex" xmlns:w16cid="http://schemas.microsoft.com/office/word/2016/wordml/cid" xmlns:w16="http://schemas.microsoft.com/office/word/2018/wordml" xmlns:w16sdtdh="http://schemas.microsoft.com/office/word/2020/wordml/sdtdatahash" xmlns:w16se="http://schemas.microsoft.com/office/word/2015/wordml/symex" xmlns:wpg="http://schemas.microsoft.com/office/word/2010/wordprocessingGroup" xmlns:wpi="http://schemas.microsoft.com/office/word/2010/wordprocessingInk" xmlns:wne="http://schemas.microsoft.com/office/word/2006/wordml" xmlns:wps="http://schemas.microsoft.com/office/word/2010/wordprocessingShape" mc:Ignorable="w14 w15 w16se w16cid w16 w16cex w16sdtdh wp14">
   <w:abstractNum w:abstractNumId="0" w15:restartNumberingAfterBreak="0">
+    <w:nsid w:val="00E86D6B"/>
+    <w:multiLevelType w:val="multilevel"/>
+    <w:tmpl w:val="DF6CE60A"/>
+    <w:lvl w:ilvl="0">
+      <w:start w:val="1"/>
+      <w:numFmt w:val="bullet"/>
+      <w:lvlText w:val=""/>
+      <w:lvlJc w:val="left"/>
+      <w:pPr>
+        <w:tabs>
+          <w:tab w:val="num" w:pos="720"/>
+        </w:tabs>
+        <w:ind w:left="720" w:hanging="360"/>
+      </w:pPr>
+      <w:rPr>
+        <w:rFonts w:ascii="Symbol" w:hAnsi="Symbol" w:hint="default"/>
+        <w:sz w:val="20"/>
+      </w:rPr>
+    </w:lvl>
+    <w:lvl w:ilvl="1" w:tentative="1">
+      <w:start w:val="1"/>
+      <w:numFmt w:val="bullet"/>
+      <w:lvlText w:val="o"/>
+      <w:lvlJc w:val="left"/>
+      <w:pPr>
+        <w:tabs>
+          <w:tab w:val="num" w:pos="1440"/>
+        </w:tabs>
+        <w:ind w:left="1440" w:hanging="360"/>
+      </w:pPr>
+      <w:rPr>
+        <w:rFonts w:ascii="Courier New" w:hAnsi="Courier New" w:hint="default"/>
+        <w:sz w:val="20"/>
+      </w:rPr>
+    </w:lvl>
+    <w:lvl w:ilvl="2" w:tentative="1">
+      <w:start w:val="1"/>
+      <w:numFmt w:val="bullet"/>
+      <w:lvlText w:val=""/>
+      <w:lvlJc w:val="left"/>
+      <w:pPr>
+        <w:tabs>
+          <w:tab w:val="num" w:pos="2160"/>
+        </w:tabs>
+        <w:ind w:left="2160" w:hanging="360"/>
+      </w:pPr>
+      <w:rPr>
+        <w:rFonts w:ascii="Wingdings" w:hAnsi="Wingdings" w:hint="default"/>
+        <w:sz w:val="20"/>
+      </w:rPr>
+    </w:lvl>
+    <w:lvl w:ilvl="3" w:tentative="1">
+      <w:start w:val="1"/>
+      <w:numFmt w:val="bullet"/>
+      <w:lvlText w:val=""/>
+      <w:lvlJc w:val="left"/>
+      <w:pPr>
+        <w:tabs>
+          <w:tab w:val="num" w:pos="2880"/>
+        </w:tabs>
+        <w:ind w:left="2880" w:hanging="360"/>
+      </w:pPr>
+      <w:rPr>
+        <w:rFonts w:ascii="Wingdings" w:hAnsi="Wingdings" w:hint="default"/>
+        <w:sz w:val="20"/>
+      </w:rPr>
+    </w:lvl>
+    <w:lvl w:ilvl="4" w:tentative="1">
+      <w:start w:val="1"/>
+      <w:numFmt w:val="bullet"/>
+      <w:lvlText w:val=""/>
+      <w:lvlJc w:val="left"/>
+      <w:pPr>
+        <w:tabs>
+          <w:tab w:val="num" w:pos="3600"/>
+        </w:tabs>
+        <w:ind w:left="3600" w:hanging="360"/>
+      </w:pPr>
+      <w:rPr>
+        <w:rFonts w:ascii="Wingdings" w:hAnsi="Wingdings" w:hint="default"/>
+        <w:sz w:val="20"/>
+      </w:rPr>
+    </w:lvl>
+    <w:lvl w:ilvl="5" w:tentative="1">
+      <w:start w:val="1"/>
+      <w:numFmt w:val="bullet"/>
+      <w:lvlText w:val=""/>
+      <w:lvlJc w:val="left"/>
+      <w:pPr>
+        <w:tabs>
+          <w:tab w:val="num" w:pos="4320"/>
+        </w:tabs>
+        <w:ind w:left="4320" w:hanging="360"/>
+      </w:pPr>
+      <w:rPr>
+        <w:rFonts w:ascii="Wingdings" w:hAnsi="Wingdings" w:hint="default"/>
+        <w:sz w:val="20"/>
+      </w:rPr>
+    </w:lvl>
+    <w:lvl w:ilvl="6" w:tentative="1">
+      <w:start w:val="1"/>
+      <w:numFmt w:val="bullet"/>
+      <w:lvlText w:val=""/>
+      <w:lvlJc w:val="left"/>
+      <w:pPr>
+        <w:tabs>
+          <w:tab w:val="num" w:pos="5040"/>
+        </w:tabs>
+        <w:ind w:left="5040" w:hanging="360"/>
+      </w:pPr>
+      <w:rPr>
+        <w:rFonts w:ascii="Wingdings" w:hAnsi="Wingdings" w:hint="default"/>
+        <w:sz w:val="20"/>
+      </w:rPr>
+    </w:lvl>
+    <w:lvl w:ilvl="7" w:tentative="1">
+      <w:start w:val="1"/>
+      <w:numFmt w:val="bullet"/>
+      <w:lvlText w:val=""/>
+      <w:lvlJc w:val="left"/>
+      <w:pPr>
+        <w:tabs>
+          <w:tab w:val="num" w:pos="5760"/>
+        </w:tabs>
+        <w:ind w:left="5760" w:hanging="360"/>
+      </w:pPr>
+      <w:rPr>
+        <w:rFonts w:ascii="Wingdings" w:hAnsi="Wingdings" w:hint="default"/>
+        <w:sz w:val="20"/>
+      </w:rPr>
+    </w:lvl>
+    <w:lvl w:ilvl="8" w:tentative="1">
+      <w:start w:val="1"/>
+      <w:numFmt w:val="bullet"/>
+      <w:lvlText w:val=""/>
+      <w:lvlJc w:val="left"/>
+      <w:pPr>
+        <w:tabs>
+          <w:tab w:val="num" w:pos="6480"/>
+        </w:tabs>
+        <w:ind w:left="6480" w:hanging="360"/>
+      </w:pPr>
+      <w:rPr>
+        <w:rFonts w:ascii="Wingdings" w:hAnsi="Wingdings" w:hint="default"/>
+        <w:sz w:val="20"/>
+      </w:rPr>
+    </w:lvl>
+  </w:abstractNum>
+  <w:abstractNum w:abstractNumId="1" w15:restartNumberingAfterBreak="0">
     <w:nsid w:val="018A2A86"/>
     <w:multiLevelType w:val="multilevel"/>
     <w:tmpl w:val="3FCAA7C0"/>
@@ -1549,7 +2793,7 @@
       </w:rPr>
     </w:lvl>
   </w:abstractNum>
-  <w:abstractNum w:abstractNumId="1" w15:restartNumberingAfterBreak="0">
+  <w:abstractNum w:abstractNumId="2" w15:restartNumberingAfterBreak="0">
     <w:nsid w:val="0AFB76E6"/>
     <w:multiLevelType w:val="multilevel"/>
     <w:tmpl w:val="55ECA572"/>
@@ -1698,7 +2942,7 @@
       </w:rPr>
     </w:lvl>
   </w:abstractNum>
-  <w:abstractNum w:abstractNumId="2" w15:restartNumberingAfterBreak="0">
+  <w:abstractNum w:abstractNumId="3" w15:restartNumberingAfterBreak="0">
     <w:nsid w:val="0FD63669"/>
     <w:multiLevelType w:val="hybridMultilevel"/>
     <w:tmpl w:val="62CE0D3A"/>
@@ -1810,7 +3054,7 @@
       </w:rPr>
     </w:lvl>
   </w:abstractNum>
-  <w:abstractNum w:abstractNumId="3" w15:restartNumberingAfterBreak="0">
+  <w:abstractNum w:abstractNumId="4" w15:restartNumberingAfterBreak="0">
     <w:nsid w:val="17154191"/>
     <w:multiLevelType w:val="hybridMultilevel"/>
     <w:tmpl w:val="57AE1868"/>
@@ -1922,7 +3166,7 @@
       </w:rPr>
     </w:lvl>
   </w:abstractNum>
-  <w:abstractNum w:abstractNumId="4" w15:restartNumberingAfterBreak="0">
+  <w:abstractNum w:abstractNumId="5" w15:restartNumberingAfterBreak="0">
     <w:nsid w:val="1D631462"/>
     <w:multiLevelType w:val="multilevel"/>
     <w:tmpl w:val="3AC03024"/>
@@ -2071,7 +3315,7 @@
       </w:rPr>
     </w:lvl>
   </w:abstractNum>
-  <w:abstractNum w:abstractNumId="5" w15:restartNumberingAfterBreak="0">
+  <w:abstractNum w:abstractNumId="6" w15:restartNumberingAfterBreak="0">
     <w:nsid w:val="1ED2092A"/>
     <w:multiLevelType w:val="hybridMultilevel"/>
     <w:tmpl w:val="499650EC"/>
@@ -2160,7 +3404,7 @@
       </w:pPr>
     </w:lvl>
   </w:abstractNum>
-  <w:abstractNum w:abstractNumId="6" w15:restartNumberingAfterBreak="0">
+  <w:abstractNum w:abstractNumId="7" w15:restartNumberingAfterBreak="0">
     <w:nsid w:val="223456DD"/>
     <w:multiLevelType w:val="multilevel"/>
     <w:tmpl w:val="578E77A6"/>
@@ -2309,7 +3553,7 @@
       </w:rPr>
     </w:lvl>
   </w:abstractNum>
-  <w:abstractNum w:abstractNumId="7" w15:restartNumberingAfterBreak="0">
+  <w:abstractNum w:abstractNumId="8" w15:restartNumberingAfterBreak="0">
     <w:nsid w:val="2F6740C6"/>
     <w:multiLevelType w:val="multilevel"/>
     <w:tmpl w:val="55006B08"/>
@@ -2458,7 +3702,305 @@
       </w:rPr>
     </w:lvl>
   </w:abstractNum>
-  <w:abstractNum w:abstractNumId="8" w15:restartNumberingAfterBreak="0">
+  <w:abstractNum w:abstractNumId="9" w15:restartNumberingAfterBreak="0">
+    <w:nsid w:val="3C141C35"/>
+    <w:multiLevelType w:val="multilevel"/>
+    <w:tmpl w:val="A6989D2C"/>
+    <w:lvl w:ilvl="0">
+      <w:start w:val="1"/>
+      <w:numFmt w:val="bullet"/>
+      <w:lvlText w:val=""/>
+      <w:lvlJc w:val="left"/>
+      <w:pPr>
+        <w:tabs>
+          <w:tab w:val="num" w:pos="720"/>
+        </w:tabs>
+        <w:ind w:left="720" w:hanging="360"/>
+      </w:pPr>
+      <w:rPr>
+        <w:rFonts w:ascii="Symbol" w:hAnsi="Symbol" w:hint="default"/>
+        <w:sz w:val="20"/>
+      </w:rPr>
+    </w:lvl>
+    <w:lvl w:ilvl="1" w:tentative="1">
+      <w:start w:val="1"/>
+      <w:numFmt w:val="bullet"/>
+      <w:lvlText w:val="o"/>
+      <w:lvlJc w:val="left"/>
+      <w:pPr>
+        <w:tabs>
+          <w:tab w:val="num" w:pos="1440"/>
+        </w:tabs>
+        <w:ind w:left="1440" w:hanging="360"/>
+      </w:pPr>
+      <w:rPr>
+        <w:rFonts w:ascii="Courier New" w:hAnsi="Courier New" w:hint="default"/>
+        <w:sz w:val="20"/>
+      </w:rPr>
+    </w:lvl>
+    <w:lvl w:ilvl="2" w:tentative="1">
+      <w:start w:val="1"/>
+      <w:numFmt w:val="bullet"/>
+      <w:lvlText w:val=""/>
+      <w:lvlJc w:val="left"/>
+      <w:pPr>
+        <w:tabs>
+          <w:tab w:val="num" w:pos="2160"/>
+        </w:tabs>
+        <w:ind w:left="2160" w:hanging="360"/>
+      </w:pPr>
+      <w:rPr>
+        <w:rFonts w:ascii="Wingdings" w:hAnsi="Wingdings" w:hint="default"/>
+        <w:sz w:val="20"/>
+      </w:rPr>
+    </w:lvl>
+    <w:lvl w:ilvl="3" w:tentative="1">
+      <w:start w:val="1"/>
+      <w:numFmt w:val="bullet"/>
+      <w:lvlText w:val=""/>
+      <w:lvlJc w:val="left"/>
+      <w:pPr>
+        <w:tabs>
+          <w:tab w:val="num" w:pos="2880"/>
+        </w:tabs>
+        <w:ind w:left="2880" w:hanging="360"/>
+      </w:pPr>
+      <w:rPr>
+        <w:rFonts w:ascii="Wingdings" w:hAnsi="Wingdings" w:hint="default"/>
+        <w:sz w:val="20"/>
+      </w:rPr>
+    </w:lvl>
+    <w:lvl w:ilvl="4" w:tentative="1">
+      <w:start w:val="1"/>
+      <w:numFmt w:val="bullet"/>
+      <w:lvlText w:val=""/>
+      <w:lvlJc w:val="left"/>
+      <w:pPr>
+        <w:tabs>
+          <w:tab w:val="num" w:pos="3600"/>
+        </w:tabs>
+        <w:ind w:left="3600" w:hanging="360"/>
+      </w:pPr>
+      <w:rPr>
+        <w:rFonts w:ascii="Wingdings" w:hAnsi="Wingdings" w:hint="default"/>
+        <w:sz w:val="20"/>
+      </w:rPr>
+    </w:lvl>
+    <w:lvl w:ilvl="5" w:tentative="1">
+      <w:start w:val="1"/>
+      <w:numFmt w:val="bullet"/>
+      <w:lvlText w:val=""/>
+      <w:lvlJc w:val="left"/>
+      <w:pPr>
+        <w:tabs>
+          <w:tab w:val="num" w:pos="4320"/>
+        </w:tabs>
+        <w:ind w:left="4320" w:hanging="360"/>
+      </w:pPr>
+      <w:rPr>
+        <w:rFonts w:ascii="Wingdings" w:hAnsi="Wingdings" w:hint="default"/>
+        <w:sz w:val="20"/>
+      </w:rPr>
+    </w:lvl>
+    <w:lvl w:ilvl="6" w:tentative="1">
+      <w:start w:val="1"/>
+      <w:numFmt w:val="bullet"/>
+      <w:lvlText w:val=""/>
+      <w:lvlJc w:val="left"/>
+      <w:pPr>
+        <w:tabs>
+          <w:tab w:val="num" w:pos="5040"/>
+        </w:tabs>
+        <w:ind w:left="5040" w:hanging="360"/>
+      </w:pPr>
+      <w:rPr>
+        <w:rFonts w:ascii="Wingdings" w:hAnsi="Wingdings" w:hint="default"/>
+        <w:sz w:val="20"/>
+      </w:rPr>
+    </w:lvl>
+    <w:lvl w:ilvl="7" w:tentative="1">
+      <w:start w:val="1"/>
+      <w:numFmt w:val="bullet"/>
+      <w:lvlText w:val=""/>
+      <w:lvlJc w:val="left"/>
+      <w:pPr>
+        <w:tabs>
+          <w:tab w:val="num" w:pos="5760"/>
+        </w:tabs>
+        <w:ind w:left="5760" w:hanging="360"/>
+      </w:pPr>
+      <w:rPr>
+        <w:rFonts w:ascii="Wingdings" w:hAnsi="Wingdings" w:hint="default"/>
+        <w:sz w:val="20"/>
+      </w:rPr>
+    </w:lvl>
+    <w:lvl w:ilvl="8" w:tentative="1">
+      <w:start w:val="1"/>
+      <w:numFmt w:val="bullet"/>
+      <w:lvlText w:val=""/>
+      <w:lvlJc w:val="left"/>
+      <w:pPr>
+        <w:tabs>
+          <w:tab w:val="num" w:pos="6480"/>
+        </w:tabs>
+        <w:ind w:left="6480" w:hanging="360"/>
+      </w:pPr>
+      <w:rPr>
+        <w:rFonts w:ascii="Wingdings" w:hAnsi="Wingdings" w:hint="default"/>
+        <w:sz w:val="20"/>
+      </w:rPr>
+    </w:lvl>
+  </w:abstractNum>
+  <w:abstractNum w:abstractNumId="10" w15:restartNumberingAfterBreak="0">
+    <w:nsid w:val="3E4B7602"/>
+    <w:multiLevelType w:val="multilevel"/>
+    <w:tmpl w:val="E2768E22"/>
+    <w:lvl w:ilvl="0">
+      <w:start w:val="1"/>
+      <w:numFmt w:val="bullet"/>
+      <w:lvlText w:val=""/>
+      <w:lvlJc w:val="left"/>
+      <w:pPr>
+        <w:tabs>
+          <w:tab w:val="num" w:pos="720"/>
+        </w:tabs>
+        <w:ind w:left="720" w:hanging="360"/>
+      </w:pPr>
+      <w:rPr>
+        <w:rFonts w:ascii="Symbol" w:hAnsi="Symbol" w:hint="default"/>
+        <w:sz w:val="20"/>
+      </w:rPr>
+    </w:lvl>
+    <w:lvl w:ilvl="1" w:tentative="1">
+      <w:start w:val="1"/>
+      <w:numFmt w:val="bullet"/>
+      <w:lvlText w:val="o"/>
+      <w:lvlJc w:val="left"/>
+      <w:pPr>
+        <w:tabs>
+          <w:tab w:val="num" w:pos="1440"/>
+        </w:tabs>
+        <w:ind w:left="1440" w:hanging="360"/>
+      </w:pPr>
+      <w:rPr>
+        <w:rFonts w:ascii="Courier New" w:hAnsi="Courier New" w:hint="default"/>
+        <w:sz w:val="20"/>
+      </w:rPr>
+    </w:lvl>
+    <w:lvl w:ilvl="2" w:tentative="1">
+      <w:start w:val="1"/>
+      <w:numFmt w:val="bullet"/>
+      <w:lvlText w:val=""/>
+      <w:lvlJc w:val="left"/>
+      <w:pPr>
+        <w:tabs>
+          <w:tab w:val="num" w:pos="2160"/>
+        </w:tabs>
+        <w:ind w:left="2160" w:hanging="360"/>
+      </w:pPr>
+      <w:rPr>
+        <w:rFonts w:ascii="Wingdings" w:hAnsi="Wingdings" w:hint="default"/>
+        <w:sz w:val="20"/>
+      </w:rPr>
+    </w:lvl>
+    <w:lvl w:ilvl="3" w:tentative="1">
+      <w:start w:val="1"/>
+      <w:numFmt w:val="bullet"/>
+      <w:lvlText w:val=""/>
+      <w:lvlJc w:val="left"/>
+      <w:pPr>
+        <w:tabs>
+          <w:tab w:val="num" w:pos="2880"/>
+        </w:tabs>
+        <w:ind w:left="2880" w:hanging="360"/>
+      </w:pPr>
+      <w:rPr>
+        <w:rFonts w:ascii="Wingdings" w:hAnsi="Wingdings" w:hint="default"/>
+        <w:sz w:val="20"/>
+      </w:rPr>
+    </w:lvl>
+    <w:lvl w:ilvl="4" w:tentative="1">
+      <w:start w:val="1"/>
+      <w:numFmt w:val="bullet"/>
+      <w:lvlText w:val=""/>
+      <w:lvlJc w:val="left"/>
+      <w:pPr>
+        <w:tabs>
+          <w:tab w:val="num" w:pos="3600"/>
+        </w:tabs>
+        <w:ind w:left="3600" w:hanging="360"/>
+      </w:pPr>
+      <w:rPr>
+        <w:rFonts w:ascii="Wingdings" w:hAnsi="Wingdings" w:hint="default"/>
+        <w:sz w:val="20"/>
+      </w:rPr>
+    </w:lvl>
+    <w:lvl w:ilvl="5" w:tentative="1">
+      <w:start w:val="1"/>
+      <w:numFmt w:val="bullet"/>
+      <w:lvlText w:val=""/>
+      <w:lvlJc w:val="left"/>
+      <w:pPr>
+        <w:tabs>
+          <w:tab w:val="num" w:pos="4320"/>
+        </w:tabs>
+        <w:ind w:left="4320" w:hanging="360"/>
+      </w:pPr>
+      <w:rPr>
+        <w:rFonts w:ascii="Wingdings" w:hAnsi="Wingdings" w:hint="default"/>
+        <w:sz w:val="20"/>
+      </w:rPr>
+    </w:lvl>
+    <w:lvl w:ilvl="6" w:tentative="1">
+      <w:start w:val="1"/>
+      <w:numFmt w:val="bullet"/>
+      <w:lvlText w:val=""/>
+      <w:lvlJc w:val="left"/>
+      <w:pPr>
+        <w:tabs>
+          <w:tab w:val="num" w:pos="5040"/>
+        </w:tabs>
+        <w:ind w:left="5040" w:hanging="360"/>
+      </w:pPr>
+      <w:rPr>
+        <w:rFonts w:ascii="Wingdings" w:hAnsi="Wingdings" w:hint="default"/>
+        <w:sz w:val="20"/>
+      </w:rPr>
+    </w:lvl>
+    <w:lvl w:ilvl="7" w:tentative="1">
+      <w:start w:val="1"/>
+      <w:numFmt w:val="bullet"/>
+      <w:lvlText w:val=""/>
+      <w:lvlJc w:val="left"/>
+      <w:pPr>
+        <w:tabs>
+          <w:tab w:val="num" w:pos="5760"/>
+        </w:tabs>
+        <w:ind w:left="5760" w:hanging="360"/>
+      </w:pPr>
+      <w:rPr>
+        <w:rFonts w:ascii="Wingdings" w:hAnsi="Wingdings" w:hint="default"/>
+        <w:sz w:val="20"/>
+      </w:rPr>
+    </w:lvl>
+    <w:lvl w:ilvl="8" w:tentative="1">
+      <w:start w:val="1"/>
+      <w:numFmt w:val="bullet"/>
+      <w:lvlText w:val=""/>
+      <w:lvlJc w:val="left"/>
+      <w:pPr>
+        <w:tabs>
+          <w:tab w:val="num" w:pos="6480"/>
+        </w:tabs>
+        <w:ind w:left="6480" w:hanging="360"/>
+      </w:pPr>
+      <w:rPr>
+        <w:rFonts w:ascii="Wingdings" w:hAnsi="Wingdings" w:hint="default"/>
+        <w:sz w:val="20"/>
+      </w:rPr>
+    </w:lvl>
+  </w:abstractNum>
+  <w:abstractNum w:abstractNumId="11" w15:restartNumberingAfterBreak="0">
     <w:nsid w:val="61507A65"/>
     <w:multiLevelType w:val="multilevel"/>
     <w:tmpl w:val="C4E86FFC"/>
@@ -2608,7 +4150,156 @@
       </w:rPr>
     </w:lvl>
   </w:abstractNum>
-  <w:abstractNum w:abstractNumId="9" w15:restartNumberingAfterBreak="0">
+  <w:abstractNum w:abstractNumId="12" w15:restartNumberingAfterBreak="0">
+    <w:nsid w:val="68862D47"/>
+    <w:multiLevelType w:val="multilevel"/>
+    <w:tmpl w:val="6E007A24"/>
+    <w:lvl w:ilvl="0">
+      <w:start w:val="1"/>
+      <w:numFmt w:val="bullet"/>
+      <w:lvlText w:val=""/>
+      <w:lvlJc w:val="left"/>
+      <w:pPr>
+        <w:tabs>
+          <w:tab w:val="num" w:pos="720"/>
+        </w:tabs>
+        <w:ind w:left="720" w:hanging="360"/>
+      </w:pPr>
+      <w:rPr>
+        <w:rFonts w:ascii="Symbol" w:hAnsi="Symbol" w:hint="default"/>
+        <w:sz w:val="20"/>
+      </w:rPr>
+    </w:lvl>
+    <w:lvl w:ilvl="1" w:tentative="1">
+      <w:start w:val="1"/>
+      <w:numFmt w:val="bullet"/>
+      <w:lvlText w:val="o"/>
+      <w:lvlJc w:val="left"/>
+      <w:pPr>
+        <w:tabs>
+          <w:tab w:val="num" w:pos="1440"/>
+        </w:tabs>
+        <w:ind w:left="1440" w:hanging="360"/>
+      </w:pPr>
+      <w:rPr>
+        <w:rFonts w:ascii="Courier New" w:hAnsi="Courier New" w:hint="default"/>
+        <w:sz w:val="20"/>
+      </w:rPr>
+    </w:lvl>
+    <w:lvl w:ilvl="2" w:tentative="1">
+      <w:start w:val="1"/>
+      <w:numFmt w:val="bullet"/>
+      <w:lvlText w:val=""/>
+      <w:lvlJc w:val="left"/>
+      <w:pPr>
+        <w:tabs>
+          <w:tab w:val="num" w:pos="2160"/>
+        </w:tabs>
+        <w:ind w:left="2160" w:hanging="360"/>
+      </w:pPr>
+      <w:rPr>
+        <w:rFonts w:ascii="Wingdings" w:hAnsi="Wingdings" w:hint="default"/>
+        <w:sz w:val="20"/>
+      </w:rPr>
+    </w:lvl>
+    <w:lvl w:ilvl="3" w:tentative="1">
+      <w:start w:val="1"/>
+      <w:numFmt w:val="bullet"/>
+      <w:lvlText w:val=""/>
+      <w:lvlJc w:val="left"/>
+      <w:pPr>
+        <w:tabs>
+          <w:tab w:val="num" w:pos="2880"/>
+        </w:tabs>
+        <w:ind w:left="2880" w:hanging="360"/>
+      </w:pPr>
+      <w:rPr>
+        <w:rFonts w:ascii="Wingdings" w:hAnsi="Wingdings" w:hint="default"/>
+        <w:sz w:val="20"/>
+      </w:rPr>
+    </w:lvl>
+    <w:lvl w:ilvl="4" w:tentative="1">
+      <w:start w:val="1"/>
+      <w:numFmt w:val="bullet"/>
+      <w:lvlText w:val=""/>
+      <w:lvlJc w:val="left"/>
+      <w:pPr>
+        <w:tabs>
+          <w:tab w:val="num" w:pos="3600"/>
+        </w:tabs>
+        <w:ind w:left="3600" w:hanging="360"/>
+      </w:pPr>
+      <w:rPr>
+        <w:rFonts w:ascii="Wingdings" w:hAnsi="Wingdings" w:hint="default"/>
+        <w:sz w:val="20"/>
+      </w:rPr>
+    </w:lvl>
+    <w:lvl w:ilvl="5" w:tentative="1">
+      <w:start w:val="1"/>
+      <w:numFmt w:val="bullet"/>
+      <w:lvlText w:val=""/>
+      <w:lvlJc w:val="left"/>
+      <w:pPr>
+        <w:tabs>
+          <w:tab w:val="num" w:pos="4320"/>
+        </w:tabs>
+        <w:ind w:left="4320" w:hanging="360"/>
+      </w:pPr>
+      <w:rPr>
+        <w:rFonts w:ascii="Wingdings" w:hAnsi="Wingdings" w:hint="default"/>
+        <w:sz w:val="20"/>
+      </w:rPr>
+    </w:lvl>
+    <w:lvl w:ilvl="6" w:tentative="1">
+      <w:start w:val="1"/>
+      <w:numFmt w:val="bullet"/>
+      <w:lvlText w:val=""/>
+      <w:lvlJc w:val="left"/>
+      <w:pPr>
+        <w:tabs>
+          <w:tab w:val="num" w:pos="5040"/>
+        </w:tabs>
+        <w:ind w:left="5040" w:hanging="360"/>
+      </w:pPr>
+      <w:rPr>
+        <w:rFonts w:ascii="Wingdings" w:hAnsi="Wingdings" w:hint="default"/>
+        <w:sz w:val="20"/>
+      </w:rPr>
+    </w:lvl>
+    <w:lvl w:ilvl="7" w:tentative="1">
+      <w:start w:val="1"/>
+      <w:numFmt w:val="bullet"/>
+      <w:lvlText w:val=""/>
+      <w:lvlJc w:val="left"/>
+      <w:pPr>
+        <w:tabs>
+          <w:tab w:val="num" w:pos="5760"/>
+        </w:tabs>
+        <w:ind w:left="5760" w:hanging="360"/>
+      </w:pPr>
+      <w:rPr>
+        <w:rFonts w:ascii="Wingdings" w:hAnsi="Wingdings" w:hint="default"/>
+        <w:sz w:val="20"/>
+      </w:rPr>
+    </w:lvl>
+    <w:lvl w:ilvl="8" w:tentative="1">
+      <w:start w:val="1"/>
+      <w:numFmt w:val="bullet"/>
+      <w:lvlText w:val=""/>
+      <w:lvlJc w:val="left"/>
+      <w:pPr>
+        <w:tabs>
+          <w:tab w:val="num" w:pos="6480"/>
+        </w:tabs>
+        <w:ind w:left="6480" w:hanging="360"/>
+      </w:pPr>
+      <w:rPr>
+        <w:rFonts w:ascii="Wingdings" w:hAnsi="Wingdings" w:hint="default"/>
+        <w:sz w:val="20"/>
+      </w:rPr>
+    </w:lvl>
+  </w:abstractNum>
+  <w:abstractNum w:abstractNumId="13" w15:restartNumberingAfterBreak="0">
     <w:nsid w:val="73CC22EC"/>
     <w:multiLevelType w:val="hybridMultilevel"/>
     <w:tmpl w:val="831C5D76"/>
@@ -2699,35 +4390,139 @@
       </w:pPr>
     </w:lvl>
   </w:abstractNum>
+  <w:abstractNum w:abstractNumId="14" w15:restartNumberingAfterBreak="0">
+    <w:nsid w:val="799A5036"/>
+    <w:multiLevelType w:val="hybridMultilevel"/>
+    <w:tmpl w:val="5038F0A0"/>
+    <w:lvl w:ilvl="0" w:tplc="D236D816">
+      <w:start w:val="1"/>
+      <w:numFmt w:val="upperLetter"/>
+      <w:lvlText w:val="%1)"/>
+      <w:lvlJc w:val="left"/>
+      <w:pPr>
+        <w:ind w:left="720" w:hanging="360"/>
+      </w:pPr>
+      <w:rPr>
+        <w:rFonts w:hint="default"/>
+      </w:rPr>
+    </w:lvl>
+    <w:lvl w:ilvl="1" w:tplc="0C0A0019" w:tentative="1">
+      <w:start w:val="1"/>
+      <w:numFmt w:val="lowerLetter"/>
+      <w:lvlText w:val="%2."/>
+      <w:lvlJc w:val="left"/>
+      <w:pPr>
+        <w:ind w:left="1440" w:hanging="360"/>
+      </w:pPr>
+    </w:lvl>
+    <w:lvl w:ilvl="2" w:tplc="0C0A001B" w:tentative="1">
+      <w:start w:val="1"/>
+      <w:numFmt w:val="lowerRoman"/>
+      <w:lvlText w:val="%3."/>
+      <w:lvlJc w:val="right"/>
+      <w:pPr>
+        <w:ind w:left="2160" w:hanging="180"/>
+      </w:pPr>
+    </w:lvl>
+    <w:lvl w:ilvl="3" w:tplc="0C0A000F" w:tentative="1">
+      <w:start w:val="1"/>
+      <w:numFmt w:val="decimal"/>
+      <w:lvlText w:val="%4."/>
+      <w:lvlJc w:val="left"/>
+      <w:pPr>
+        <w:ind w:left="2880" w:hanging="360"/>
+      </w:pPr>
+    </w:lvl>
+    <w:lvl w:ilvl="4" w:tplc="0C0A0019" w:tentative="1">
+      <w:start w:val="1"/>
+      <w:numFmt w:val="lowerLetter"/>
+      <w:lvlText w:val="%5."/>
+      <w:lvlJc w:val="left"/>
+      <w:pPr>
+        <w:ind w:left="3600" w:hanging="360"/>
+      </w:pPr>
+    </w:lvl>
+    <w:lvl w:ilvl="5" w:tplc="0C0A001B" w:tentative="1">
+      <w:start w:val="1"/>
+      <w:numFmt w:val="lowerRoman"/>
+      <w:lvlText w:val="%6."/>
+      <w:lvlJc w:val="right"/>
+      <w:pPr>
+        <w:ind w:left="4320" w:hanging="180"/>
+      </w:pPr>
+    </w:lvl>
+    <w:lvl w:ilvl="6" w:tplc="0C0A000F" w:tentative="1">
+      <w:start w:val="1"/>
+      <w:numFmt w:val="decimal"/>
+      <w:lvlText w:val="%7."/>
+      <w:lvlJc w:val="left"/>
+      <w:pPr>
+        <w:ind w:left="5040" w:hanging="360"/>
+      </w:pPr>
+    </w:lvl>
+    <w:lvl w:ilvl="7" w:tplc="0C0A0019" w:tentative="1">
+      <w:start w:val="1"/>
+      <w:numFmt w:val="lowerLetter"/>
+      <w:lvlText w:val="%8."/>
+      <w:lvlJc w:val="left"/>
+      <w:pPr>
+        <w:ind w:left="5760" w:hanging="360"/>
+      </w:pPr>
+    </w:lvl>
+    <w:lvl w:ilvl="8" w:tplc="0C0A001B" w:tentative="1">
+      <w:start w:val="1"/>
+      <w:numFmt w:val="lowerRoman"/>
+      <w:lvlText w:val="%9."/>
+      <w:lvlJc w:val="right"/>
+      <w:pPr>
+        <w:ind w:left="6480" w:hanging="180"/>
+      </w:pPr>
+    </w:lvl>
+  </w:abstractNum>
   <w:num w:numId="1" w16cid:durableId="1480533383">
+    <w:abstractNumId w:val="7"/>
+  </w:num>
+  <w:num w:numId="2" w16cid:durableId="287204733">
+    <w:abstractNumId w:val="3"/>
+  </w:num>
+  <w:num w:numId="3" w16cid:durableId="1450778491">
+    <w:abstractNumId w:val="11"/>
+  </w:num>
+  <w:num w:numId="4" w16cid:durableId="323169028">
+    <w:abstractNumId w:val="13"/>
+  </w:num>
+  <w:num w:numId="5" w16cid:durableId="541527444">
     <w:abstractNumId w:val="6"/>
   </w:num>
-  <w:num w:numId="2" w16cid:durableId="287204733">
+  <w:num w:numId="6" w16cid:durableId="1928541995">
+    <w:abstractNumId w:val="1"/>
+  </w:num>
+  <w:num w:numId="7" w16cid:durableId="1247150757">
+    <w:abstractNumId w:val="8"/>
+  </w:num>
+  <w:num w:numId="8" w16cid:durableId="216165823">
+    <w:abstractNumId w:val="5"/>
+  </w:num>
+  <w:num w:numId="9" w16cid:durableId="1473448355">
     <w:abstractNumId w:val="2"/>
   </w:num>
-  <w:num w:numId="3" w16cid:durableId="1450778491">
-    <w:abstractNumId w:val="8"/>
+  <w:num w:numId="10" w16cid:durableId="410271980">
+    <w:abstractNumId w:val="4"/>
   </w:num>
-  <w:num w:numId="4" w16cid:durableId="323169028">
+  <w:num w:numId="11" w16cid:durableId="473371941">
     <w:abstractNumId w:val="9"/>
   </w:num>
-  <w:num w:numId="5" w16cid:durableId="541527444">
-    <w:abstractNumId w:val="5"/>
+  <w:num w:numId="12" w16cid:durableId="288516761">
+    <w:abstractNumId w:val="12"/>
   </w:num>
-  <w:num w:numId="6" w16cid:durableId="1928541995">
+  <w:num w:numId="13" w16cid:durableId="442070120">
+    <w:abstractNumId w:val="10"/>
+  </w:num>
+  <w:num w:numId="14" w16cid:durableId="1413813756">
     <w:abstractNumId w:val="0"/>
   </w:num>
-  <w:num w:numId="7" w16cid:durableId="1247150757">
-    <w:abstractNumId w:val="7"/>
-  </w:num>
-  <w:num w:numId="8" w16cid:durableId="216165823">
-    <w:abstractNumId w:val="4"/>
-  </w:num>
-  <w:num w:numId="9" w16cid:durableId="1473448355">
-    <w:abstractNumId w:val="1"/>
-  </w:num>
-  <w:num w:numId="10" w16cid:durableId="410271980">
-    <w:abstractNumId w:val="3"/>
+  <w:num w:numId="15" w16cid:durableId="541065678">
+    <w:abstractNumId w:val="14"/>
   </w:num>
 </w:numbering>
 </file>
@@ -3190,7 +4985,6 @@
     <w:next w:val="Normal"/>
     <w:link w:val="Ttulo3Car"/>
     <w:uiPriority w:val="9"/>
-    <w:semiHidden/>
     <w:unhideWhenUsed/>
     <w:qFormat/>
     <w:rsid w:val="00681503"/>
@@ -3396,7 +5190,6 @@
     <w:basedOn w:val="Fuentedeprrafopredeter"/>
     <w:link w:val="Ttulo3"/>
     <w:uiPriority w:val="9"/>
-    <w:semiHidden/>
     <w:rsid w:val="00681503"/>
     <w:rPr>
       <w:rFonts w:eastAsiaTheme="majorEastAsia" w:cstheme="majorBidi"/>

</xml_diff>